<commit_message>
docs: fix 3 errors in TESTING_AND_HARDWARE_GUIDE.docx
1. Section 6 /logs endpoint: corrected '60 entries' -> '200 entries'
   (buffer was increased to 200 in a prior commit)

2. Section 11 YOLO testing: removed incorrect 'python main.py --simulate'
   command. Simulation mode only generates synthetic ArUco markers and
   does not produce real obstacle detections from a camera. Corrected
   to 'python main.py' (live camera) with an explanatory note.

3. Phase 2 camera calibration: added a warning callout that
   tools/calibrate_camera.py does not yet exist and must be created
   before this step can be followed.

Co-Authored-By: Claude Sonnet 4.6 <noreply@anthropic.com>
</commit_message>
<xml_diff>
--- a/TESTING_AND_HARDWARE_GUIDE.docx
+++ b/TESTING_AND_HARDWARE_GUIDE.docx
@@ -3729,7 +3729,7 @@
                 <w:sz w:val="20"/>
                 <w:szCs w:val="20"/>
               </w:rPr>
-              <w:t xml:space="preserve">Last 60 log entries (JSON)</w:t>
+              <w:t xml:space="preserve">Last 200 log entries (JSON)</w:t>
             </w:r>
           </w:p>
         </w:tc>
@@ -4727,8 +4727,13 @@
           <w:sz w:val="22"/>
           <w:szCs w:val="22"/>
         </w:rPr>
-        <w:t xml:space="preserve">YOLO requires ultralytics (model is auto-downloaded on first run):</w:t>
-      </w:r>
+        <w:t xml:space="preserve">YOLO requires ultralytics (model is auto-downloaded on first run). You need a real USB camera for this test — YOLO detects real-world objects in the live feed.</w:t>
+      </w:r>
+    </w:p>
+    <w:p>
+      <w:pPr>
+        <w:spacing w:after="0" w:before="40"/>
+      </w:pPr>
     </w:p>
     <w:p>
       <w:pPr>
@@ -4743,7 +4748,26 @@
           <w:sz w:val="18"/>
           <w:szCs w:val="18"/>
         </w:rPr>
-        <w:t xml:space="preserve">python main.py --simulate</w:t>
+        <w:t xml:space="preserve">python main.py</w:t>
+      </w:r>
+    </w:p>
+    <w:p>
+      <w:pPr>
+        <w:spacing w:after="0" w:before="40"/>
+      </w:pPr>
+    </w:p>
+    <w:p>
+      <w:pPr>
+        <w:spacing w:after="60" w:before="60"/>
+      </w:pPr>
+      <w:r>
+        <w:rPr>
+          <w:rFonts w:ascii="Arial" w:cs="Arial" w:eastAsia="Arial" w:hAnsi="Arial"/>
+          <w:color w:val="1A1A1A"/>
+          <w:sz w:val="22"/>
+          <w:szCs w:val="22"/>
+        </w:rPr>
+        <w:t xml:space="preserve">Note: Use python main.py (live camera), not --simulate. Simulation generates synthetic ArUco markers only and does not produce real obstacle detections.</w:t>
       </w:r>
     </w:p>
     <w:p>
@@ -4764,7 +4788,7 @@
           <w:sz w:val="22"/>
           <w:szCs w:val="22"/>
         </w:rPr>
-        <w:t xml:space="preserve">Point a camera at a person or use a printed photo. Verify:</w:t>
+        <w:t xml:space="preserve">Point your camera at a person. Verify:</w:t>
       </w:r>
     </w:p>
     <w:p>
@@ -6017,6 +6041,21 @@
           <w:szCs w:val="24"/>
         </w:rPr>
         <w:t xml:space="preserve">Step 2 — Run the calibration script</w:t>
+      </w:r>
+    </w:p>
+    <w:p>
+      <w:pPr>
+        <w:shd w:fill="FFF3CD" w:val="clear"/>
+        <w:spacing w:after="60" w:before="60"/>
+      </w:pPr>
+      <w:r>
+        <w:rPr>
+          <w:rFonts w:ascii="Arial" w:cs="Arial" w:eastAsia="Arial" w:hAnsi="Arial"/>
+          <w:color w:val="856404"/>
+          <w:sz w:val="22"/>
+          <w:szCs w:val="22"/>
+        </w:rPr>
+        <w:t xml:space="preserve">  NOTE: tools/calibrate_camera.py must be created before this step. Ask your developer to add it, or use any standard OpenCV chessboard calibration script.</w:t>
       </w:r>
     </w:p>
     <w:p>

</xml_diff>

<commit_message>
docs: update Hardware Guide with side sensors, U-turn calibration, re-entry
- Part 2 now opens with a 'Where you are now / next step' note and a
  9-phase roadmap-at-a-glance table
- Procurement table: added side distance sensors x2 (ultrasonic / 1D LiDAR);
  markers row notes LAST-ROW & STOP markers
- Phase 4 marker deployment: NORMAL / LAST-ROW / STOP table + centred vs
  45-degree side-pole mounting guidance (ArUco up to ~65 deg)
- New Phase 5 — Side Sensor Installation (lane-keeping): mounting, centring
  logic table, calibration steps
- New Phase 6 — U-Turn Calibration & Sensor-Confirmed Re-Entry: why the turn
  is pre-calibrated to row spacing, half-circle vs Omega turn, sensor-lock
  re-entry steps
- Renumbered Bench->7, Field->8, Monitoring->9; extended bench/field
  checklists with sensor + re-entry + LAST-ROW/STOP items
- Tuning guide: added side-sensor gain and re-entry tolerance rows

Co-Authored-By: Claude Opus 4.8 <noreply@anthropic.com>
</commit_message>
<xml_diff>
--- a/TESTING_AND_HARDWARE_GUIDE.docx
+++ b/TESTING_AND_HARDWARE_GUIDE.docx
@@ -5274,6 +5274,973 @@
     </w:p>
     <w:p>
       <w:pPr>
+        <w:shd w:fill="E8F5E9" w:val="clear"/>
+        <w:spacing w:after="80" w:before="60"/>
+      </w:pPr>
+      <w:r>
+        <w:rPr>
+          <w:rFonts w:ascii="Arial" w:cs="Arial" w:eastAsia="Arial" w:hAnsi="Arial"/>
+          <w:b/>
+          <w:bCs/>
+          <w:color w:val="2E7D32"/>
+          <w:sz w:val="22"/>
+          <w:szCs w:val="22"/>
+        </w:rPr>
+        <w:t xml:space="preserve">  WHERE YOU ARE NOW: The software is complete and fully validated in simulation (marker detection, U-turn, side-sensor lane-keeping, sensor-confirmed re-entry, obstacle stop, field-end markers). The next step is HARDWARE. Start with Phase 1 (procurement) and Phase 2 (camera calibration) — calibration can be done immediately with just a camera, no robot required.</w:t>
+      </w:r>
+    </w:p>
+    <w:p>
+      <w:pPr>
+        <w:spacing w:after="0" w:before="40"/>
+      </w:pPr>
+    </w:p>
+    <w:p>
+      <w:pPr>
+        <w:pStyle w:val="Heading2"/>
+        <w:pBdr>
+          <w:bottom w:val="single" w:color="2E75B6" w:sz="8" w:space="1"/>
+        </w:pBdr>
+        <w:spacing w:after="80" w:before="280"/>
+      </w:pPr>
+      <w:r>
+        <w:rPr>
+          <w:rFonts w:ascii="Arial" w:cs="Arial" w:eastAsia="Arial" w:hAnsi="Arial"/>
+          <w:b/>
+          <w:bCs/>
+          <w:color w:val="2E75B6"/>
+          <w:sz w:val="28"/>
+          <w:szCs w:val="28"/>
+        </w:rPr>
+        <w:t xml:space="preserve">Roadmap at a glance</w:t>
+      </w:r>
+    </w:p>
+    <w:tbl>
+      <w:tblPr>
+        <w:tblW w:type="dxa" w:w="10080"/>
+        <w:tblBorders>
+          <w:top w:val="single" w:color="auto" w:sz="4"/>
+          <w:left w:val="single" w:color="auto" w:sz="4"/>
+          <w:bottom w:val="single" w:color="auto" w:sz="4"/>
+          <w:right w:val="single" w:color="auto" w:sz="4"/>
+          <w:insideH w:val="single" w:color="auto" w:sz="4"/>
+          <w:insideV w:val="single" w:color="auto" w:sz="4"/>
+        </w:tblBorders>
+      </w:tblPr>
+      <w:tblGrid>
+        <w:gridCol w:w="1400"/>
+        <w:gridCol w:w="5400"/>
+        <w:gridCol w:w="3280"/>
+      </w:tblGrid>
+      <w:tr>
+        <w:trPr>
+          <w:tblHeader/>
+        </w:trPr>
+        <w:tc>
+          <w:tcPr>
+            <w:tcW w:type="dxa" w:w="1400"/>
+            <w:tcBorders>
+              <w:top w:val="single" w:color="2E75B6" w:sz="4"/>
+              <w:left w:val="single" w:color="2E75B6" w:sz="4"/>
+              <w:bottom w:val="single" w:color="2E75B6" w:sz="4"/>
+              <w:right w:val="single" w:color="2E75B6" w:sz="4"/>
+            </w:tcBorders>
+            <w:shd w:fill="1F4E79" w:val="clear"/>
+            <w:tcMar>
+              <w:top w:type="dxa" w:w="80"/>
+              <w:left w:type="dxa" w:w="120"/>
+              <w:bottom w:type="dxa" w:w="80"/>
+              <w:right w:type="dxa" w:w="120"/>
+            </w:tcMar>
+            <w:vAlign w:val="center"/>
+          </w:tcPr>
+          <w:p>
+            <w:r>
+              <w:rPr>
+                <w:rFonts w:ascii="Arial" w:cs="Arial" w:eastAsia="Arial" w:hAnsi="Arial"/>
+                <w:b/>
+                <w:bCs/>
+                <w:color w:val="FFFFFF"/>
+                <w:sz w:val="20"/>
+                <w:szCs w:val="20"/>
+              </w:rPr>
+              <w:t xml:space="preserve">Phase</w:t>
+            </w:r>
+          </w:p>
+        </w:tc>
+        <w:tc>
+          <w:tcPr>
+            <w:tcW w:type="dxa" w:w="5400"/>
+            <w:tcBorders>
+              <w:top w:val="single" w:color="2E75B6" w:sz="4"/>
+              <w:left w:val="single" w:color="2E75B6" w:sz="4"/>
+              <w:bottom w:val="single" w:color="2E75B6" w:sz="4"/>
+              <w:right w:val="single" w:color="2E75B6" w:sz="4"/>
+            </w:tcBorders>
+            <w:shd w:fill="1F4E79" w:val="clear"/>
+            <w:tcMar>
+              <w:top w:type="dxa" w:w="80"/>
+              <w:left w:type="dxa" w:w="120"/>
+              <w:bottom w:type="dxa" w:w="80"/>
+              <w:right w:type="dxa" w:w="120"/>
+            </w:tcMar>
+            <w:vAlign w:val="center"/>
+          </w:tcPr>
+          <w:p>
+            <w:r>
+              <w:rPr>
+                <w:rFonts w:ascii="Arial" w:cs="Arial" w:eastAsia="Arial" w:hAnsi="Arial"/>
+                <w:b/>
+                <w:bCs/>
+                <w:color w:val="FFFFFF"/>
+                <w:sz w:val="20"/>
+                <w:szCs w:val="20"/>
+              </w:rPr>
+              <w:t xml:space="preserve">What</w:t>
+            </w:r>
+          </w:p>
+        </w:tc>
+        <w:tc>
+          <w:tcPr>
+            <w:tcW w:type="dxa" w:w="3280"/>
+            <w:tcBorders>
+              <w:top w:val="single" w:color="2E75B6" w:sz="4"/>
+              <w:left w:val="single" w:color="2E75B6" w:sz="4"/>
+              <w:bottom w:val="single" w:color="2E75B6" w:sz="4"/>
+              <w:right w:val="single" w:color="2E75B6" w:sz="4"/>
+            </w:tcBorders>
+            <w:shd w:fill="1F4E79" w:val="clear"/>
+            <w:tcMar>
+              <w:top w:type="dxa" w:w="80"/>
+              <w:left w:type="dxa" w:w="120"/>
+              <w:bottom w:type="dxa" w:w="80"/>
+              <w:right w:type="dxa" w:w="120"/>
+            </w:tcMar>
+            <w:vAlign w:val="center"/>
+          </w:tcPr>
+          <w:p>
+            <w:r>
+              <w:rPr>
+                <w:rFonts w:ascii="Arial" w:cs="Arial" w:eastAsia="Arial" w:hAnsi="Arial"/>
+                <w:b/>
+                <w:bCs/>
+                <w:color w:val="FFFFFF"/>
+                <w:sz w:val="20"/>
+                <w:szCs w:val="20"/>
+              </w:rPr>
+              <w:t xml:space="preserve">Needs the robot?</w:t>
+            </w:r>
+          </w:p>
+        </w:tc>
+      </w:tr>
+      <w:tr>
+        <w:tc>
+          <w:tcPr>
+            <w:tcW w:type="dxa" w:w="1400"/>
+            <w:tcBorders>
+              <w:top w:val="single" w:color="CCCCCC" w:sz="4"/>
+              <w:left w:val="single" w:color="CCCCCC" w:sz="4"/>
+              <w:bottom w:val="single" w:color="CCCCCC" w:sz="4"/>
+              <w:right w:val="single" w:color="CCCCCC" w:sz="4"/>
+            </w:tcBorders>
+            <w:shd w:fill="FFFFFF" w:val="clear"/>
+            <w:tcMar>
+              <w:top w:type="dxa" w:w="80"/>
+              <w:left w:type="dxa" w:w="120"/>
+              <w:bottom w:type="dxa" w:w="80"/>
+              <w:right w:type="dxa" w:w="120"/>
+            </w:tcMar>
+          </w:tcPr>
+          <w:p>
+            <w:r>
+              <w:rPr>
+                <w:rFonts w:ascii="Arial" w:cs="Arial" w:eastAsia="Arial" w:hAnsi="Arial"/>
+                <w:color w:val="1A1A1A"/>
+                <w:sz w:val="20"/>
+                <w:szCs w:val="20"/>
+              </w:rPr>
+              <w:t xml:space="preserve">1</w:t>
+            </w:r>
+          </w:p>
+        </w:tc>
+        <w:tc>
+          <w:tcPr>
+            <w:tcW w:type="dxa" w:w="5400"/>
+            <w:tcBorders>
+              <w:top w:val="single" w:color="CCCCCC" w:sz="4"/>
+              <w:left w:val="single" w:color="CCCCCC" w:sz="4"/>
+              <w:bottom w:val="single" w:color="CCCCCC" w:sz="4"/>
+              <w:right w:val="single" w:color="CCCCCC" w:sz="4"/>
+            </w:tcBorders>
+            <w:shd w:fill="FFFFFF" w:val="clear"/>
+            <w:tcMar>
+              <w:top w:type="dxa" w:w="80"/>
+              <w:left w:type="dxa" w:w="120"/>
+              <w:bottom w:type="dxa" w:w="80"/>
+              <w:right w:type="dxa" w:w="120"/>
+            </w:tcMar>
+          </w:tcPr>
+          <w:p>
+            <w:r>
+              <w:rPr>
+                <w:rFonts w:ascii="Arial" w:cs="Arial" w:eastAsia="Arial" w:hAnsi="Arial"/>
+                <w:color w:val="1A1A1A"/>
+                <w:sz w:val="20"/>
+                <w:szCs w:val="20"/>
+              </w:rPr>
+              <w:t xml:space="preserve">Procure hardware</w:t>
+            </w:r>
+          </w:p>
+        </w:tc>
+        <w:tc>
+          <w:tcPr>
+            <w:tcW w:type="dxa" w:w="3280"/>
+            <w:tcBorders>
+              <w:top w:val="single" w:color="CCCCCC" w:sz="4"/>
+              <w:left w:val="single" w:color="CCCCCC" w:sz="4"/>
+              <w:bottom w:val="single" w:color="CCCCCC" w:sz="4"/>
+              <w:right w:val="single" w:color="CCCCCC" w:sz="4"/>
+            </w:tcBorders>
+            <w:shd w:fill="FFFFFF" w:val="clear"/>
+            <w:tcMar>
+              <w:top w:type="dxa" w:w="80"/>
+              <w:left w:type="dxa" w:w="120"/>
+              <w:bottom w:type="dxa" w:w="80"/>
+              <w:right w:type="dxa" w:w="120"/>
+            </w:tcMar>
+          </w:tcPr>
+          <w:p>
+            <w:r>
+              <w:rPr>
+                <w:rFonts w:ascii="Arial" w:cs="Arial" w:eastAsia="Arial" w:hAnsi="Arial"/>
+                <w:color w:val="1A1A1A"/>
+                <w:sz w:val="20"/>
+                <w:szCs w:val="20"/>
+              </w:rPr>
+              <w:t xml:space="preserve">No</w:t>
+            </w:r>
+          </w:p>
+        </w:tc>
+      </w:tr>
+      <w:tr>
+        <w:tc>
+          <w:tcPr>
+            <w:tcW w:type="dxa" w:w="1400"/>
+            <w:tcBorders>
+              <w:top w:val="single" w:color="CCCCCC" w:sz="4"/>
+              <w:left w:val="single" w:color="CCCCCC" w:sz="4"/>
+              <w:bottom w:val="single" w:color="CCCCCC" w:sz="4"/>
+              <w:right w:val="single" w:color="CCCCCC" w:sz="4"/>
+            </w:tcBorders>
+            <w:shd w:fill="F2F2F2" w:val="clear"/>
+            <w:tcMar>
+              <w:top w:type="dxa" w:w="80"/>
+              <w:left w:type="dxa" w:w="120"/>
+              <w:bottom w:type="dxa" w:w="80"/>
+              <w:right w:type="dxa" w:w="120"/>
+            </w:tcMar>
+          </w:tcPr>
+          <w:p>
+            <w:r>
+              <w:rPr>
+                <w:rFonts w:ascii="Arial" w:cs="Arial" w:eastAsia="Arial" w:hAnsi="Arial"/>
+                <w:color w:val="1A1A1A"/>
+                <w:sz w:val="20"/>
+                <w:szCs w:val="20"/>
+              </w:rPr>
+              <w:t xml:space="preserve">2</w:t>
+            </w:r>
+          </w:p>
+        </w:tc>
+        <w:tc>
+          <w:tcPr>
+            <w:tcW w:type="dxa" w:w="5400"/>
+            <w:tcBorders>
+              <w:top w:val="single" w:color="CCCCCC" w:sz="4"/>
+              <w:left w:val="single" w:color="CCCCCC" w:sz="4"/>
+              <w:bottom w:val="single" w:color="CCCCCC" w:sz="4"/>
+              <w:right w:val="single" w:color="CCCCCC" w:sz="4"/>
+            </w:tcBorders>
+            <w:shd w:fill="F2F2F2" w:val="clear"/>
+            <w:tcMar>
+              <w:top w:type="dxa" w:w="80"/>
+              <w:left w:type="dxa" w:w="120"/>
+              <w:bottom w:type="dxa" w:w="80"/>
+              <w:right w:type="dxa" w:w="120"/>
+            </w:tcMar>
+          </w:tcPr>
+          <w:p>
+            <w:r>
+              <w:rPr>
+                <w:rFonts w:ascii="Arial" w:cs="Arial" w:eastAsia="Arial" w:hAnsi="Arial"/>
+                <w:color w:val="1A1A1A"/>
+                <w:sz w:val="20"/>
+                <w:szCs w:val="20"/>
+              </w:rPr>
+              <w:t xml:space="preserve">Camera calibration</w:t>
+            </w:r>
+          </w:p>
+        </w:tc>
+        <w:tc>
+          <w:tcPr>
+            <w:tcW w:type="dxa" w:w="3280"/>
+            <w:tcBorders>
+              <w:top w:val="single" w:color="CCCCCC" w:sz="4"/>
+              <w:left w:val="single" w:color="CCCCCC" w:sz="4"/>
+              <w:bottom w:val="single" w:color="CCCCCC" w:sz="4"/>
+              <w:right w:val="single" w:color="CCCCCC" w:sz="4"/>
+            </w:tcBorders>
+            <w:shd w:fill="F2F2F2" w:val="clear"/>
+            <w:tcMar>
+              <w:top w:type="dxa" w:w="80"/>
+              <w:left w:type="dxa" w:w="120"/>
+              <w:bottom w:type="dxa" w:w="80"/>
+              <w:right w:type="dxa" w:w="120"/>
+            </w:tcMar>
+          </w:tcPr>
+          <w:p>
+            <w:r>
+              <w:rPr>
+                <w:rFonts w:ascii="Arial" w:cs="Arial" w:eastAsia="Arial" w:hAnsi="Arial"/>
+                <w:color w:val="1A1A1A"/>
+                <w:sz w:val="20"/>
+                <w:szCs w:val="20"/>
+              </w:rPr>
+              <w:t xml:space="preserve">No — camera only</w:t>
+            </w:r>
+          </w:p>
+        </w:tc>
+      </w:tr>
+      <w:tr>
+        <w:tc>
+          <w:tcPr>
+            <w:tcW w:type="dxa" w:w="1400"/>
+            <w:tcBorders>
+              <w:top w:val="single" w:color="CCCCCC" w:sz="4"/>
+              <w:left w:val="single" w:color="CCCCCC" w:sz="4"/>
+              <w:bottom w:val="single" w:color="CCCCCC" w:sz="4"/>
+              <w:right w:val="single" w:color="CCCCCC" w:sz="4"/>
+            </w:tcBorders>
+            <w:shd w:fill="FFFFFF" w:val="clear"/>
+            <w:tcMar>
+              <w:top w:type="dxa" w:w="80"/>
+              <w:left w:type="dxa" w:w="120"/>
+              <w:bottom w:type="dxa" w:w="80"/>
+              <w:right w:type="dxa" w:w="120"/>
+            </w:tcMar>
+          </w:tcPr>
+          <w:p>
+            <w:r>
+              <w:rPr>
+                <w:rFonts w:ascii="Arial" w:cs="Arial" w:eastAsia="Arial" w:hAnsi="Arial"/>
+                <w:color w:val="1A1A1A"/>
+                <w:sz w:val="20"/>
+                <w:szCs w:val="20"/>
+              </w:rPr>
+              <w:t xml:space="preserve">3</w:t>
+            </w:r>
+          </w:p>
+        </w:tc>
+        <w:tc>
+          <w:tcPr>
+            <w:tcW w:type="dxa" w:w="5400"/>
+            <w:tcBorders>
+              <w:top w:val="single" w:color="CCCCCC" w:sz="4"/>
+              <w:left w:val="single" w:color="CCCCCC" w:sz="4"/>
+              <w:bottom w:val="single" w:color="CCCCCC" w:sz="4"/>
+              <w:right w:val="single" w:color="CCCCCC" w:sz="4"/>
+            </w:tcBorders>
+            <w:shd w:fill="FFFFFF" w:val="clear"/>
+            <w:tcMar>
+              <w:top w:type="dxa" w:w="80"/>
+              <w:left w:type="dxa" w:w="120"/>
+              <w:bottom w:type="dxa" w:w="80"/>
+              <w:right w:type="dxa" w:w="120"/>
+            </w:tcMar>
+          </w:tcPr>
+          <w:p>
+            <w:r>
+              <w:rPr>
+                <w:rFonts w:ascii="Arial" w:cs="Arial" w:eastAsia="Arial" w:hAnsi="Arial"/>
+                <w:color w:val="1A1A1A"/>
+                <w:sz w:val="20"/>
+                <w:szCs w:val="20"/>
+              </w:rPr>
+              <w:t xml:space="preserve">CAN bus + steering controller</w:t>
+            </w:r>
+          </w:p>
+        </w:tc>
+        <w:tc>
+          <w:tcPr>
+            <w:tcW w:type="dxa" w:w="3280"/>
+            <w:tcBorders>
+              <w:top w:val="single" w:color="CCCCCC" w:sz="4"/>
+              <w:left w:val="single" w:color="CCCCCC" w:sz="4"/>
+              <w:bottom w:val="single" w:color="CCCCCC" w:sz="4"/>
+              <w:right w:val="single" w:color="CCCCCC" w:sz="4"/>
+            </w:tcBorders>
+            <w:shd w:fill="FFFFFF" w:val="clear"/>
+            <w:tcMar>
+              <w:top w:type="dxa" w:w="80"/>
+              <w:left w:type="dxa" w:w="120"/>
+              <w:bottom w:type="dxa" w:w="80"/>
+              <w:right w:type="dxa" w:w="120"/>
+            </w:tcMar>
+          </w:tcPr>
+          <w:p>
+            <w:r>
+              <w:rPr>
+                <w:rFonts w:ascii="Arial" w:cs="Arial" w:eastAsia="Arial" w:hAnsi="Arial"/>
+                <w:color w:val="1A1A1A"/>
+                <w:sz w:val="20"/>
+                <w:szCs w:val="20"/>
+              </w:rPr>
+              <w:t xml:space="preserve">Bench OK</w:t>
+            </w:r>
+          </w:p>
+        </w:tc>
+      </w:tr>
+      <w:tr>
+        <w:tc>
+          <w:tcPr>
+            <w:tcW w:type="dxa" w:w="1400"/>
+            <w:tcBorders>
+              <w:top w:val="single" w:color="CCCCCC" w:sz="4"/>
+              <w:left w:val="single" w:color="CCCCCC" w:sz="4"/>
+              <w:bottom w:val="single" w:color="CCCCCC" w:sz="4"/>
+              <w:right w:val="single" w:color="CCCCCC" w:sz="4"/>
+            </w:tcBorders>
+            <w:shd w:fill="F2F2F2" w:val="clear"/>
+            <w:tcMar>
+              <w:top w:type="dxa" w:w="80"/>
+              <w:left w:type="dxa" w:w="120"/>
+              <w:bottom w:type="dxa" w:w="80"/>
+              <w:right w:type="dxa" w:w="120"/>
+            </w:tcMar>
+          </w:tcPr>
+          <w:p>
+            <w:r>
+              <w:rPr>
+                <w:rFonts w:ascii="Arial" w:cs="Arial" w:eastAsia="Arial" w:hAnsi="Arial"/>
+                <w:color w:val="1A1A1A"/>
+                <w:sz w:val="20"/>
+                <w:szCs w:val="20"/>
+              </w:rPr>
+              <w:t xml:space="preserve">4</w:t>
+            </w:r>
+          </w:p>
+        </w:tc>
+        <w:tc>
+          <w:tcPr>
+            <w:tcW w:type="dxa" w:w="5400"/>
+            <w:tcBorders>
+              <w:top w:val="single" w:color="CCCCCC" w:sz="4"/>
+              <w:left w:val="single" w:color="CCCCCC" w:sz="4"/>
+              <w:bottom w:val="single" w:color="CCCCCC" w:sz="4"/>
+              <w:right w:val="single" w:color="CCCCCC" w:sz="4"/>
+            </w:tcBorders>
+            <w:shd w:fill="F2F2F2" w:val="clear"/>
+            <w:tcMar>
+              <w:top w:type="dxa" w:w="80"/>
+              <w:left w:type="dxa" w:w="120"/>
+              <w:bottom w:type="dxa" w:w="80"/>
+              <w:right w:type="dxa" w:w="120"/>
+            </w:tcMar>
+          </w:tcPr>
+          <w:p>
+            <w:r>
+              <w:rPr>
+                <w:rFonts w:ascii="Arial" w:cs="Arial" w:eastAsia="Arial" w:hAnsi="Arial"/>
+                <w:color w:val="1A1A1A"/>
+                <w:sz w:val="20"/>
+                <w:szCs w:val="20"/>
+              </w:rPr>
+              <w:t xml:space="preserve">ArUco / marker deployment</w:t>
+            </w:r>
+          </w:p>
+        </w:tc>
+        <w:tc>
+          <w:tcPr>
+            <w:tcW w:type="dxa" w:w="3280"/>
+            <w:tcBorders>
+              <w:top w:val="single" w:color="CCCCCC" w:sz="4"/>
+              <w:left w:val="single" w:color="CCCCCC" w:sz="4"/>
+              <w:bottom w:val="single" w:color="CCCCCC" w:sz="4"/>
+              <w:right w:val="single" w:color="CCCCCC" w:sz="4"/>
+            </w:tcBorders>
+            <w:shd w:fill="F2F2F2" w:val="clear"/>
+            <w:tcMar>
+              <w:top w:type="dxa" w:w="80"/>
+              <w:left w:type="dxa" w:w="120"/>
+              <w:bottom w:type="dxa" w:w="80"/>
+              <w:right w:type="dxa" w:w="120"/>
+            </w:tcMar>
+          </w:tcPr>
+          <w:p>
+            <w:r>
+              <w:rPr>
+                <w:rFonts w:ascii="Arial" w:cs="Arial" w:eastAsia="Arial" w:hAnsi="Arial"/>
+                <w:color w:val="1A1A1A"/>
+                <w:sz w:val="20"/>
+                <w:szCs w:val="20"/>
+              </w:rPr>
+              <w:t xml:space="preserve">No</w:t>
+            </w:r>
+          </w:p>
+        </w:tc>
+      </w:tr>
+      <w:tr>
+        <w:tc>
+          <w:tcPr>
+            <w:tcW w:type="dxa" w:w="1400"/>
+            <w:tcBorders>
+              <w:top w:val="single" w:color="CCCCCC" w:sz="4"/>
+              <w:left w:val="single" w:color="CCCCCC" w:sz="4"/>
+              <w:bottom w:val="single" w:color="CCCCCC" w:sz="4"/>
+              <w:right w:val="single" w:color="CCCCCC" w:sz="4"/>
+            </w:tcBorders>
+            <w:shd w:fill="FFFFFF" w:val="clear"/>
+            <w:tcMar>
+              <w:top w:type="dxa" w:w="80"/>
+              <w:left w:type="dxa" w:w="120"/>
+              <w:bottom w:type="dxa" w:w="80"/>
+              <w:right w:type="dxa" w:w="120"/>
+            </w:tcMar>
+          </w:tcPr>
+          <w:p>
+            <w:r>
+              <w:rPr>
+                <w:rFonts w:ascii="Arial" w:cs="Arial" w:eastAsia="Arial" w:hAnsi="Arial"/>
+                <w:color w:val="1A1A1A"/>
+                <w:sz w:val="20"/>
+                <w:szCs w:val="20"/>
+              </w:rPr>
+              <w:t xml:space="preserve">5</w:t>
+            </w:r>
+          </w:p>
+        </w:tc>
+        <w:tc>
+          <w:tcPr>
+            <w:tcW w:type="dxa" w:w="5400"/>
+            <w:tcBorders>
+              <w:top w:val="single" w:color="CCCCCC" w:sz="4"/>
+              <w:left w:val="single" w:color="CCCCCC" w:sz="4"/>
+              <w:bottom w:val="single" w:color="CCCCCC" w:sz="4"/>
+              <w:right w:val="single" w:color="CCCCCC" w:sz="4"/>
+            </w:tcBorders>
+            <w:shd w:fill="FFFFFF" w:val="clear"/>
+            <w:tcMar>
+              <w:top w:type="dxa" w:w="80"/>
+              <w:left w:type="dxa" w:w="120"/>
+              <w:bottom w:type="dxa" w:w="80"/>
+              <w:right w:type="dxa" w:w="120"/>
+            </w:tcMar>
+          </w:tcPr>
+          <w:p>
+            <w:r>
+              <w:rPr>
+                <w:rFonts w:ascii="Arial" w:cs="Arial" w:eastAsia="Arial" w:hAnsi="Arial"/>
+                <w:color w:val="1A1A1A"/>
+                <w:sz w:val="20"/>
+                <w:szCs w:val="20"/>
+              </w:rPr>
+              <w:t xml:space="preserve">Side sensor install + calibration</w:t>
+            </w:r>
+          </w:p>
+        </w:tc>
+        <w:tc>
+          <w:tcPr>
+            <w:tcW w:type="dxa" w:w="3280"/>
+            <w:tcBorders>
+              <w:top w:val="single" w:color="CCCCCC" w:sz="4"/>
+              <w:left w:val="single" w:color="CCCCCC" w:sz="4"/>
+              <w:bottom w:val="single" w:color="CCCCCC" w:sz="4"/>
+              <w:right w:val="single" w:color="CCCCCC" w:sz="4"/>
+            </w:tcBorders>
+            <w:shd w:fill="FFFFFF" w:val="clear"/>
+            <w:tcMar>
+              <w:top w:type="dxa" w:w="80"/>
+              <w:left w:type="dxa" w:w="120"/>
+              <w:bottom w:type="dxa" w:w="80"/>
+              <w:right w:type="dxa" w:w="120"/>
+            </w:tcMar>
+          </w:tcPr>
+          <w:p>
+            <w:r>
+              <w:rPr>
+                <w:rFonts w:ascii="Arial" w:cs="Arial" w:eastAsia="Arial" w:hAnsi="Arial"/>
+                <w:color w:val="1A1A1A"/>
+                <w:sz w:val="20"/>
+                <w:szCs w:val="20"/>
+              </w:rPr>
+              <w:t xml:space="preserve">Yes</w:t>
+            </w:r>
+          </w:p>
+        </w:tc>
+      </w:tr>
+      <w:tr>
+        <w:tc>
+          <w:tcPr>
+            <w:tcW w:type="dxa" w:w="1400"/>
+            <w:tcBorders>
+              <w:top w:val="single" w:color="CCCCCC" w:sz="4"/>
+              <w:left w:val="single" w:color="CCCCCC" w:sz="4"/>
+              <w:bottom w:val="single" w:color="CCCCCC" w:sz="4"/>
+              <w:right w:val="single" w:color="CCCCCC" w:sz="4"/>
+            </w:tcBorders>
+            <w:shd w:fill="F2F2F2" w:val="clear"/>
+            <w:tcMar>
+              <w:top w:type="dxa" w:w="80"/>
+              <w:left w:type="dxa" w:w="120"/>
+              <w:bottom w:type="dxa" w:w="80"/>
+              <w:right w:type="dxa" w:w="120"/>
+            </w:tcMar>
+          </w:tcPr>
+          <w:p>
+            <w:r>
+              <w:rPr>
+                <w:rFonts w:ascii="Arial" w:cs="Arial" w:eastAsia="Arial" w:hAnsi="Arial"/>
+                <w:color w:val="1A1A1A"/>
+                <w:sz w:val="20"/>
+                <w:szCs w:val="20"/>
+              </w:rPr>
+              <w:t xml:space="preserve">6</w:t>
+            </w:r>
+          </w:p>
+        </w:tc>
+        <w:tc>
+          <w:tcPr>
+            <w:tcW w:type="dxa" w:w="5400"/>
+            <w:tcBorders>
+              <w:top w:val="single" w:color="CCCCCC" w:sz="4"/>
+              <w:left w:val="single" w:color="CCCCCC" w:sz="4"/>
+              <w:bottom w:val="single" w:color="CCCCCC" w:sz="4"/>
+              <w:right w:val="single" w:color="CCCCCC" w:sz="4"/>
+            </w:tcBorders>
+            <w:shd w:fill="F2F2F2" w:val="clear"/>
+            <w:tcMar>
+              <w:top w:type="dxa" w:w="80"/>
+              <w:left w:type="dxa" w:w="120"/>
+              <w:bottom w:type="dxa" w:w="80"/>
+              <w:right w:type="dxa" w:w="120"/>
+            </w:tcMar>
+          </w:tcPr>
+          <w:p>
+            <w:r>
+              <w:rPr>
+                <w:rFonts w:ascii="Arial" w:cs="Arial" w:eastAsia="Arial" w:hAnsi="Arial"/>
+                <w:color w:val="1A1A1A"/>
+                <w:sz w:val="20"/>
+                <w:szCs w:val="20"/>
+              </w:rPr>
+              <w:t xml:space="preserve">U-turn calibration + re-entry</w:t>
+            </w:r>
+          </w:p>
+        </w:tc>
+        <w:tc>
+          <w:tcPr>
+            <w:tcW w:type="dxa" w:w="3280"/>
+            <w:tcBorders>
+              <w:top w:val="single" w:color="CCCCCC" w:sz="4"/>
+              <w:left w:val="single" w:color="CCCCCC" w:sz="4"/>
+              <w:bottom w:val="single" w:color="CCCCCC" w:sz="4"/>
+              <w:right w:val="single" w:color="CCCCCC" w:sz="4"/>
+            </w:tcBorders>
+            <w:shd w:fill="F2F2F2" w:val="clear"/>
+            <w:tcMar>
+              <w:top w:type="dxa" w:w="80"/>
+              <w:left w:type="dxa" w:w="120"/>
+              <w:bottom w:type="dxa" w:w="80"/>
+              <w:right w:type="dxa" w:w="120"/>
+            </w:tcMar>
+          </w:tcPr>
+          <w:p>
+            <w:r>
+              <w:rPr>
+                <w:rFonts w:ascii="Arial" w:cs="Arial" w:eastAsia="Arial" w:hAnsi="Arial"/>
+                <w:color w:val="1A1A1A"/>
+                <w:sz w:val="20"/>
+                <w:szCs w:val="20"/>
+              </w:rPr>
+              <w:t xml:space="preserve">Yes</w:t>
+            </w:r>
+          </w:p>
+        </w:tc>
+      </w:tr>
+      <w:tr>
+        <w:tc>
+          <w:tcPr>
+            <w:tcW w:type="dxa" w:w="1400"/>
+            <w:tcBorders>
+              <w:top w:val="single" w:color="CCCCCC" w:sz="4"/>
+              <w:left w:val="single" w:color="CCCCCC" w:sz="4"/>
+              <w:bottom w:val="single" w:color="CCCCCC" w:sz="4"/>
+              <w:right w:val="single" w:color="CCCCCC" w:sz="4"/>
+            </w:tcBorders>
+            <w:shd w:fill="FFFFFF" w:val="clear"/>
+            <w:tcMar>
+              <w:top w:type="dxa" w:w="80"/>
+              <w:left w:type="dxa" w:w="120"/>
+              <w:bottom w:type="dxa" w:w="80"/>
+              <w:right w:type="dxa" w:w="120"/>
+            </w:tcMar>
+          </w:tcPr>
+          <w:p>
+            <w:r>
+              <w:rPr>
+                <w:rFonts w:ascii="Arial" w:cs="Arial" w:eastAsia="Arial" w:hAnsi="Arial"/>
+                <w:color w:val="1A1A1A"/>
+                <w:sz w:val="20"/>
+                <w:szCs w:val="20"/>
+              </w:rPr>
+              <w:t xml:space="preserve">7</w:t>
+            </w:r>
+          </w:p>
+        </w:tc>
+        <w:tc>
+          <w:tcPr>
+            <w:tcW w:type="dxa" w:w="5400"/>
+            <w:tcBorders>
+              <w:top w:val="single" w:color="CCCCCC" w:sz="4"/>
+              <w:left w:val="single" w:color="CCCCCC" w:sz="4"/>
+              <w:bottom w:val="single" w:color="CCCCCC" w:sz="4"/>
+              <w:right w:val="single" w:color="CCCCCC" w:sz="4"/>
+            </w:tcBorders>
+            <w:shd w:fill="FFFFFF" w:val="clear"/>
+            <w:tcMar>
+              <w:top w:type="dxa" w:w="80"/>
+              <w:left w:type="dxa" w:w="120"/>
+              <w:bottom w:type="dxa" w:w="80"/>
+              <w:right w:type="dxa" w:w="120"/>
+            </w:tcMar>
+          </w:tcPr>
+          <w:p>
+            <w:r>
+              <w:rPr>
+                <w:rFonts w:ascii="Arial" w:cs="Arial" w:eastAsia="Arial" w:hAnsi="Arial"/>
+                <w:color w:val="1A1A1A"/>
+                <w:sz w:val="20"/>
+                <w:szCs w:val="20"/>
+              </w:rPr>
+              <w:t xml:space="preserve">Bench integration test</w:t>
+            </w:r>
+          </w:p>
+        </w:tc>
+        <w:tc>
+          <w:tcPr>
+            <w:tcW w:type="dxa" w:w="3280"/>
+            <w:tcBorders>
+              <w:top w:val="single" w:color="CCCCCC" w:sz="4"/>
+              <w:left w:val="single" w:color="CCCCCC" w:sz="4"/>
+              <w:bottom w:val="single" w:color="CCCCCC" w:sz="4"/>
+              <w:right w:val="single" w:color="CCCCCC" w:sz="4"/>
+            </w:tcBorders>
+            <w:shd w:fill="FFFFFF" w:val="clear"/>
+            <w:tcMar>
+              <w:top w:type="dxa" w:w="80"/>
+              <w:left w:type="dxa" w:w="120"/>
+              <w:bottom w:type="dxa" w:w="80"/>
+              <w:right w:type="dxa" w:w="120"/>
+            </w:tcMar>
+          </w:tcPr>
+          <w:p>
+            <w:r>
+              <w:rPr>
+                <w:rFonts w:ascii="Arial" w:cs="Arial" w:eastAsia="Arial" w:hAnsi="Arial"/>
+                <w:color w:val="1A1A1A"/>
+                <w:sz w:val="20"/>
+                <w:szCs w:val="20"/>
+              </w:rPr>
+              <w:t xml:space="preserve">Yes (stationary)</w:t>
+            </w:r>
+          </w:p>
+        </w:tc>
+      </w:tr>
+      <w:tr>
+        <w:tc>
+          <w:tcPr>
+            <w:tcW w:type="dxa" w:w="1400"/>
+            <w:tcBorders>
+              <w:top w:val="single" w:color="CCCCCC" w:sz="4"/>
+              <w:left w:val="single" w:color="CCCCCC" w:sz="4"/>
+              <w:bottom w:val="single" w:color="CCCCCC" w:sz="4"/>
+              <w:right w:val="single" w:color="CCCCCC" w:sz="4"/>
+            </w:tcBorders>
+            <w:shd w:fill="F2F2F2" w:val="clear"/>
+            <w:tcMar>
+              <w:top w:type="dxa" w:w="80"/>
+              <w:left w:type="dxa" w:w="120"/>
+              <w:bottom w:type="dxa" w:w="80"/>
+              <w:right w:type="dxa" w:w="120"/>
+            </w:tcMar>
+          </w:tcPr>
+          <w:p>
+            <w:r>
+              <w:rPr>
+                <w:rFonts w:ascii="Arial" w:cs="Arial" w:eastAsia="Arial" w:hAnsi="Arial"/>
+                <w:color w:val="1A1A1A"/>
+                <w:sz w:val="20"/>
+                <w:szCs w:val="20"/>
+              </w:rPr>
+              <w:t xml:space="preserve">8</w:t>
+            </w:r>
+          </w:p>
+        </w:tc>
+        <w:tc>
+          <w:tcPr>
+            <w:tcW w:type="dxa" w:w="5400"/>
+            <w:tcBorders>
+              <w:top w:val="single" w:color="CCCCCC" w:sz="4"/>
+              <w:left w:val="single" w:color="CCCCCC" w:sz="4"/>
+              <w:bottom w:val="single" w:color="CCCCCC" w:sz="4"/>
+              <w:right w:val="single" w:color="CCCCCC" w:sz="4"/>
+            </w:tcBorders>
+            <w:shd w:fill="F2F2F2" w:val="clear"/>
+            <w:tcMar>
+              <w:top w:type="dxa" w:w="80"/>
+              <w:left w:type="dxa" w:w="120"/>
+              <w:bottom w:type="dxa" w:w="80"/>
+              <w:right w:type="dxa" w:w="120"/>
+            </w:tcMar>
+          </w:tcPr>
+          <w:p>
+            <w:r>
+              <w:rPr>
+                <w:rFonts w:ascii="Arial" w:cs="Arial" w:eastAsia="Arial" w:hAnsi="Arial"/>
+                <w:color w:val="1A1A1A"/>
+                <w:sz w:val="20"/>
+                <w:szCs w:val="20"/>
+              </w:rPr>
+              <w:t xml:space="preserve">Field testing</w:t>
+            </w:r>
+          </w:p>
+        </w:tc>
+        <w:tc>
+          <w:tcPr>
+            <w:tcW w:type="dxa" w:w="3280"/>
+            <w:tcBorders>
+              <w:top w:val="single" w:color="CCCCCC" w:sz="4"/>
+              <w:left w:val="single" w:color="CCCCCC" w:sz="4"/>
+              <w:bottom w:val="single" w:color="CCCCCC" w:sz="4"/>
+              <w:right w:val="single" w:color="CCCCCC" w:sz="4"/>
+            </w:tcBorders>
+            <w:shd w:fill="F2F2F2" w:val="clear"/>
+            <w:tcMar>
+              <w:top w:type="dxa" w:w="80"/>
+              <w:left w:type="dxa" w:w="120"/>
+              <w:bottom w:type="dxa" w:w="80"/>
+              <w:right w:type="dxa" w:w="120"/>
+            </w:tcMar>
+          </w:tcPr>
+          <w:p>
+            <w:r>
+              <w:rPr>
+                <w:rFonts w:ascii="Arial" w:cs="Arial" w:eastAsia="Arial" w:hAnsi="Arial"/>
+                <w:color w:val="1A1A1A"/>
+                <w:sz w:val="20"/>
+                <w:szCs w:val="20"/>
+              </w:rPr>
+              <w:t xml:space="preserve">Yes (in field)</w:t>
+            </w:r>
+          </w:p>
+        </w:tc>
+      </w:tr>
+      <w:tr>
+        <w:tc>
+          <w:tcPr>
+            <w:tcW w:type="dxa" w:w="1400"/>
+            <w:tcBorders>
+              <w:top w:val="single" w:color="CCCCCC" w:sz="4"/>
+              <w:left w:val="single" w:color="CCCCCC" w:sz="4"/>
+              <w:bottom w:val="single" w:color="CCCCCC" w:sz="4"/>
+              <w:right w:val="single" w:color="CCCCCC" w:sz="4"/>
+            </w:tcBorders>
+            <w:shd w:fill="FFFFFF" w:val="clear"/>
+            <w:tcMar>
+              <w:top w:type="dxa" w:w="80"/>
+              <w:left w:type="dxa" w:w="120"/>
+              <w:bottom w:type="dxa" w:w="80"/>
+              <w:right w:type="dxa" w:w="120"/>
+            </w:tcMar>
+          </w:tcPr>
+          <w:p>
+            <w:r>
+              <w:rPr>
+                <w:rFonts w:ascii="Arial" w:cs="Arial" w:eastAsia="Arial" w:hAnsi="Arial"/>
+                <w:color w:val="1A1A1A"/>
+                <w:sz w:val="20"/>
+                <w:szCs w:val="20"/>
+              </w:rPr>
+              <w:t xml:space="preserve">9</w:t>
+            </w:r>
+          </w:p>
+        </w:tc>
+        <w:tc>
+          <w:tcPr>
+            <w:tcW w:type="dxa" w:w="5400"/>
+            <w:tcBorders>
+              <w:top w:val="single" w:color="CCCCCC" w:sz="4"/>
+              <w:left w:val="single" w:color="CCCCCC" w:sz="4"/>
+              <w:bottom w:val="single" w:color="CCCCCC" w:sz="4"/>
+              <w:right w:val="single" w:color="CCCCCC" w:sz="4"/>
+            </w:tcBorders>
+            <w:shd w:fill="FFFFFF" w:val="clear"/>
+            <w:tcMar>
+              <w:top w:type="dxa" w:w="80"/>
+              <w:left w:type="dxa" w:w="120"/>
+              <w:bottom w:type="dxa" w:w="80"/>
+              <w:right w:type="dxa" w:w="120"/>
+            </w:tcMar>
+          </w:tcPr>
+          <w:p>
+            <w:r>
+              <w:rPr>
+                <w:rFonts w:ascii="Arial" w:cs="Arial" w:eastAsia="Arial" w:hAnsi="Arial"/>
+                <w:color w:val="1A1A1A"/>
+                <w:sz w:val="20"/>
+                <w:szCs w:val="20"/>
+              </w:rPr>
+              <w:t xml:space="preserve">Ongoing monitoring</w:t>
+            </w:r>
+          </w:p>
+        </w:tc>
+        <w:tc>
+          <w:tcPr>
+            <w:tcW w:type="dxa" w:w="3280"/>
+            <w:tcBorders>
+              <w:top w:val="single" w:color="CCCCCC" w:sz="4"/>
+              <w:left w:val="single" w:color="CCCCCC" w:sz="4"/>
+              <w:bottom w:val="single" w:color="CCCCCC" w:sz="4"/>
+              <w:right w:val="single" w:color="CCCCCC" w:sz="4"/>
+            </w:tcBorders>
+            <w:shd w:fill="FFFFFF" w:val="clear"/>
+            <w:tcMar>
+              <w:top w:type="dxa" w:w="80"/>
+              <w:left w:type="dxa" w:w="120"/>
+              <w:bottom w:type="dxa" w:w="80"/>
+              <w:right w:type="dxa" w:w="120"/>
+            </w:tcMar>
+          </w:tcPr>
+          <w:p>
+            <w:r>
+              <w:rPr>
+                <w:rFonts w:ascii="Arial" w:cs="Arial" w:eastAsia="Arial" w:hAnsi="Arial"/>
+                <w:color w:val="1A1A1A"/>
+                <w:sz w:val="20"/>
+                <w:szCs w:val="20"/>
+              </w:rPr>
+              <w:t xml:space="preserve">Yes</w:t>
+            </w:r>
+          </w:p>
+        </w:tc>
+      </w:tr>
+    </w:tbl>
+    <w:p>
+      <w:pPr>
+        <w:spacing w:after="0" w:before="80"/>
+      </w:pPr>
+    </w:p>
+    <w:p>
+      <w:pPr>
         <w:pStyle w:val="Heading1"/>
         <w:shd w:fill="1F4E79" w:val="clear"/>
         <w:spacing w:after="120" w:before="360"/>
@@ -5498,7 +6465,7 @@
                 <w:sz w:val="20"/>
                 <w:szCs w:val="20"/>
               </w:rPr>
-              <w:t xml:space="preserve">Main vision sensor</w:t>
+              <w:t xml:space="preserve">Main vision sensor (marker detection)</w:t>
             </w:r>
           </w:p>
         </w:tc>
@@ -5529,7 +6496,7 @@
                 <w:sz w:val="20"/>
                 <w:szCs w:val="20"/>
               </w:rPr>
-              <w:t xml:space="preserve">CAN interface</w:t>
+              <w:t xml:space="preserve">Side distance sensors x2</w:t>
             </w:r>
           </w:p>
         </w:tc>
@@ -5558,7 +6525,7 @@
                 <w:sz w:val="20"/>
                 <w:szCs w:val="20"/>
               </w:rPr>
-              <w:t xml:space="preserve">USB-CAN adapter (Kvaser Leaf / PEAK PCAN-USB)</w:t>
+              <w:t xml:space="preserve">Ultrasonic (HC-SR04 / MaxBotix) or 1D LiDAR (VL53L1X), one per side</w:t>
             </w:r>
           </w:p>
         </w:tc>
@@ -5587,7 +6554,7 @@
                 <w:sz w:val="20"/>
                 <w:szCs w:val="20"/>
               </w:rPr>
-              <w:t xml:space="preserve">Steering controller bus</w:t>
+              <w:t xml:space="preserve">Lane-keeping — measure gap to plants on each side</w:t>
             </w:r>
           </w:p>
         </w:tc>
@@ -5618,7 +6585,7 @@
                 <w:sz w:val="20"/>
                 <w:szCs w:val="20"/>
               </w:rPr>
-              <w:t xml:space="preserve">Steering controller</w:t>
+              <w:t xml:space="preserve">CAN interface</w:t>
             </w:r>
           </w:p>
         </w:tc>
@@ -5647,7 +6614,7 @@
                 <w:sz w:val="20"/>
                 <w:szCs w:val="20"/>
               </w:rPr>
-              <w:t xml:space="preserve">Accepts CAN frames on ID 0x123</w:t>
+              <w:t xml:space="preserve">USB-CAN adapter (Kvaser Leaf / PEAK PCAN-USB)</w:t>
             </w:r>
           </w:p>
         </w:tc>
@@ -5676,7 +6643,7 @@
                 <w:sz w:val="20"/>
                 <w:szCs w:val="20"/>
               </w:rPr>
-              <w:t xml:space="preserve">Executes turn/stop commands</w:t>
+              <w:t xml:space="preserve">Steering controller bus</w:t>
             </w:r>
           </w:p>
         </w:tc>
@@ -5707,7 +6674,7 @@
                 <w:sz w:val="20"/>
                 <w:szCs w:val="20"/>
               </w:rPr>
-              <w:t xml:space="preserve">ArUco markers</w:t>
+              <w:t xml:space="preserve">Steering controller</w:t>
             </w:r>
           </w:p>
         </w:tc>
@@ -5736,7 +6703,7 @@
                 <w:sz w:val="20"/>
                 <w:szCs w:val="20"/>
               </w:rPr>
-              <w:t xml:space="preserve">Printed at &gt;= 20 cm x 20 cm, laminated</w:t>
+              <w:t xml:space="preserve">Accepts CAN frames on ID 0x123; executes calibrated U-turn</w:t>
             </w:r>
           </w:p>
         </w:tc>
@@ -5765,7 +6732,7 @@
                 <w:sz w:val="20"/>
                 <w:szCs w:val="20"/>
               </w:rPr>
-              <w:t xml:space="preserve">End-of-row triggers</w:t>
+              <w:t xml:space="preserve">Executes turn / steer / stop commands</w:t>
             </w:r>
           </w:p>
         </w:tc>
@@ -5796,7 +6763,7 @@
                 <w:sz w:val="20"/>
                 <w:szCs w:val="20"/>
               </w:rPr>
-              <w:t xml:space="preserve">Single-board PC</w:t>
+              <w:t xml:space="preserve">ArUco markers</w:t>
             </w:r>
           </w:p>
         </w:tc>
@@ -5825,7 +6792,7 @@
                 <w:sz w:val="20"/>
                 <w:szCs w:val="20"/>
               </w:rPr>
-              <w:t xml:space="preserve">Raspberry Pi 5 or Jetson Nano (GPU optional)</w:t>
+              <w:t xml:space="preserve">Printed &gt;= 20 cm x 20 cm, laminated. Incl. LAST-ROW &amp; STOP markers</w:t>
             </w:r>
           </w:p>
         </w:tc>
@@ -5854,7 +6821,7 @@
                 <w:sz w:val="20"/>
                 <w:szCs w:val="20"/>
               </w:rPr>
-              <w:t xml:space="preserve">Onboard compute</w:t>
+              <w:t xml:space="preserve">End-of-row triggers + field-end markers</w:t>
             </w:r>
           </w:p>
         </w:tc>
@@ -5885,6 +6852,95 @@
                 <w:sz w:val="20"/>
                 <w:szCs w:val="20"/>
               </w:rPr>
+              <w:t xml:space="preserve">Single-board PC</w:t>
+            </w:r>
+          </w:p>
+        </w:tc>
+        <w:tc>
+          <w:tcPr>
+            <w:tcW w:type="dxa" w:w="4480"/>
+            <w:tcBorders>
+              <w:top w:val="single" w:color="CCCCCC" w:sz="4"/>
+              <w:left w:val="single" w:color="CCCCCC" w:sz="4"/>
+              <w:bottom w:val="single" w:color="CCCCCC" w:sz="4"/>
+              <w:right w:val="single" w:color="CCCCCC" w:sz="4"/>
+            </w:tcBorders>
+            <w:shd w:fill="F2F2F2" w:val="clear"/>
+            <w:tcMar>
+              <w:top w:type="dxa" w:w="80"/>
+              <w:left w:type="dxa" w:w="120"/>
+              <w:bottom w:type="dxa" w:w="80"/>
+              <w:right w:type="dxa" w:w="120"/>
+            </w:tcMar>
+          </w:tcPr>
+          <w:p>
+            <w:r>
+              <w:rPr>
+                <w:rFonts w:ascii="Arial" w:cs="Arial" w:eastAsia="Arial" w:hAnsi="Arial"/>
+                <w:color w:val="1A1A1A"/>
+                <w:sz w:val="20"/>
+                <w:szCs w:val="20"/>
+              </w:rPr>
+              <w:t xml:space="preserve">Raspberry Pi 5 or Jetson Nano (GPU optional)</w:t>
+            </w:r>
+          </w:p>
+        </w:tc>
+        <w:tc>
+          <w:tcPr>
+            <w:tcW w:type="dxa" w:w="3400"/>
+            <w:tcBorders>
+              <w:top w:val="single" w:color="CCCCCC" w:sz="4"/>
+              <w:left w:val="single" w:color="CCCCCC" w:sz="4"/>
+              <w:bottom w:val="single" w:color="CCCCCC" w:sz="4"/>
+              <w:right w:val="single" w:color="CCCCCC" w:sz="4"/>
+            </w:tcBorders>
+            <w:shd w:fill="F2F2F2" w:val="clear"/>
+            <w:tcMar>
+              <w:top w:type="dxa" w:w="80"/>
+              <w:left w:type="dxa" w:w="120"/>
+              <w:bottom w:type="dxa" w:w="80"/>
+              <w:right w:type="dxa" w:w="120"/>
+            </w:tcMar>
+          </w:tcPr>
+          <w:p>
+            <w:r>
+              <w:rPr>
+                <w:rFonts w:ascii="Arial" w:cs="Arial" w:eastAsia="Arial" w:hAnsi="Arial"/>
+                <w:color w:val="1A1A1A"/>
+                <w:sz w:val="20"/>
+                <w:szCs w:val="20"/>
+              </w:rPr>
+              <w:t xml:space="preserve">Onboard compute</w:t>
+            </w:r>
+          </w:p>
+        </w:tc>
+      </w:tr>
+      <w:tr>
+        <w:tc>
+          <w:tcPr>
+            <w:tcW w:type="dxa" w:w="2200"/>
+            <w:tcBorders>
+              <w:top w:val="single" w:color="CCCCCC" w:sz="4"/>
+              <w:left w:val="single" w:color="CCCCCC" w:sz="4"/>
+              <w:bottom w:val="single" w:color="CCCCCC" w:sz="4"/>
+              <w:right w:val="single" w:color="CCCCCC" w:sz="4"/>
+            </w:tcBorders>
+            <w:shd w:fill="FFFFFF" w:val="clear"/>
+            <w:tcMar>
+              <w:top w:type="dxa" w:w="80"/>
+              <w:left w:type="dxa" w:w="120"/>
+              <w:bottom w:type="dxa" w:w="80"/>
+              <w:right w:type="dxa" w:w="120"/>
+            </w:tcMar>
+          </w:tcPr>
+          <w:p>
+            <w:r>
+              <w:rPr>
+                <w:rFonts w:ascii="Arial" w:cs="Arial" w:eastAsia="Arial" w:hAnsi="Arial"/>
+                <w:color w:val="1A1A1A"/>
+                <w:sz w:val="20"/>
+                <w:szCs w:val="20"/>
+              </w:rPr>
               <w:t xml:space="preserve">Power supply</w:t>
             </w:r>
           </w:p>
@@ -5898,7 +6954,7 @@
               <w:bottom w:val="single" w:color="CCCCCC" w:sz="4"/>
               <w:right w:val="single" w:color="CCCCCC" w:sz="4"/>
             </w:tcBorders>
-            <w:shd w:fill="F2F2F2" w:val="clear"/>
+            <w:shd w:fill="FFFFFF" w:val="clear"/>
             <w:tcMar>
               <w:top w:type="dxa" w:w="80"/>
               <w:left w:type="dxa" w:w="120"/>
@@ -5927,7 +6983,7 @@
               <w:bottom w:val="single" w:color="CCCCCC" w:sz="4"/>
               <w:right w:val="single" w:color="CCCCCC" w:sz="4"/>
             </w:tcBorders>
-            <w:shd w:fill="F2F2F2" w:val="clear"/>
+            <w:shd w:fill="FFFFFF" w:val="clear"/>
             <w:tcMar>
               <w:top w:type="dxa" w:w="80"/>
               <w:left w:type="dxa" w:w="120"/>
@@ -6756,6 +7812,414 @@
           <w:sz w:val="24"/>
           <w:szCs w:val="24"/>
         </w:rPr>
+        <w:t xml:space="preserve">Marker types (field-size independent)</w:t>
+      </w:r>
+    </w:p>
+    <w:tbl>
+      <w:tblPr>
+        <w:tblW w:type="dxa" w:w="10080"/>
+        <w:tblBorders>
+          <w:top w:val="single" w:color="auto" w:sz="4"/>
+          <w:left w:val="single" w:color="auto" w:sz="4"/>
+          <w:bottom w:val="single" w:color="auto" w:sz="4"/>
+          <w:right w:val="single" w:color="auto" w:sz="4"/>
+          <w:insideH w:val="single" w:color="auto" w:sz="4"/>
+          <w:insideV w:val="single" w:color="auto" w:sz="4"/>
+        </w:tblBorders>
+      </w:tblPr>
+      <w:tblGrid>
+        <w:gridCol w:w="1800"/>
+        <w:gridCol w:w="3680"/>
+        <w:gridCol w:w="4600"/>
+      </w:tblGrid>
+      <w:tr>
+        <w:trPr>
+          <w:tblHeader/>
+        </w:trPr>
+        <w:tc>
+          <w:tcPr>
+            <w:tcW w:type="dxa" w:w="1800"/>
+            <w:tcBorders>
+              <w:top w:val="single" w:color="2E75B6" w:sz="4"/>
+              <w:left w:val="single" w:color="2E75B6" w:sz="4"/>
+              <w:bottom w:val="single" w:color="2E75B6" w:sz="4"/>
+              <w:right w:val="single" w:color="2E75B6" w:sz="4"/>
+            </w:tcBorders>
+            <w:shd w:fill="1F4E79" w:val="clear"/>
+            <w:tcMar>
+              <w:top w:type="dxa" w:w="80"/>
+              <w:left w:type="dxa" w:w="120"/>
+              <w:bottom w:type="dxa" w:w="80"/>
+              <w:right w:type="dxa" w:w="120"/>
+            </w:tcMar>
+            <w:vAlign w:val="center"/>
+          </w:tcPr>
+          <w:p>
+            <w:r>
+              <w:rPr>
+                <w:rFonts w:ascii="Arial" w:cs="Arial" w:eastAsia="Arial" w:hAnsi="Arial"/>
+                <w:b/>
+                <w:bCs/>
+                <w:color w:val="FFFFFF"/>
+                <w:sz w:val="20"/>
+                <w:szCs w:val="20"/>
+              </w:rPr>
+              <w:t xml:space="preserve">Marker</w:t>
+            </w:r>
+          </w:p>
+        </w:tc>
+        <w:tc>
+          <w:tcPr>
+            <w:tcW w:type="dxa" w:w="3680"/>
+            <w:tcBorders>
+              <w:top w:val="single" w:color="2E75B6" w:sz="4"/>
+              <w:left w:val="single" w:color="2E75B6" w:sz="4"/>
+              <w:bottom w:val="single" w:color="2E75B6" w:sz="4"/>
+              <w:right w:val="single" w:color="2E75B6" w:sz="4"/>
+            </w:tcBorders>
+            <w:shd w:fill="1F4E79" w:val="clear"/>
+            <w:tcMar>
+              <w:top w:type="dxa" w:w="80"/>
+              <w:left w:type="dxa" w:w="120"/>
+              <w:bottom w:type="dxa" w:w="80"/>
+              <w:right w:type="dxa" w:w="120"/>
+            </w:tcMar>
+            <w:vAlign w:val="center"/>
+          </w:tcPr>
+          <w:p>
+            <w:r>
+              <w:rPr>
+                <w:rFonts w:ascii="Arial" w:cs="Arial" w:eastAsia="Arial" w:hAnsi="Arial"/>
+                <w:b/>
+                <w:bCs/>
+                <w:color w:val="FFFFFF"/>
+                <w:sz w:val="20"/>
+                <w:szCs w:val="20"/>
+              </w:rPr>
+              <w:t xml:space="preserve">ArUco ID (default)</w:t>
+            </w:r>
+          </w:p>
+        </w:tc>
+        <w:tc>
+          <w:tcPr>
+            <w:tcW w:type="dxa" w:w="4600"/>
+            <w:tcBorders>
+              <w:top w:val="single" w:color="2E75B6" w:sz="4"/>
+              <w:left w:val="single" w:color="2E75B6" w:sz="4"/>
+              <w:bottom w:val="single" w:color="2E75B6" w:sz="4"/>
+              <w:right w:val="single" w:color="2E75B6" w:sz="4"/>
+            </w:tcBorders>
+            <w:shd w:fill="1F4E79" w:val="clear"/>
+            <w:tcMar>
+              <w:top w:type="dxa" w:w="80"/>
+              <w:left w:type="dxa" w:w="120"/>
+              <w:bottom w:type="dxa" w:w="80"/>
+              <w:right w:type="dxa" w:w="120"/>
+            </w:tcMar>
+            <w:vAlign w:val="center"/>
+          </w:tcPr>
+          <w:p>
+            <w:r>
+              <w:rPr>
+                <w:rFonts w:ascii="Arial" w:cs="Arial" w:eastAsia="Arial" w:hAnsi="Arial"/>
+                <w:b/>
+                <w:bCs/>
+                <w:color w:val="FFFFFF"/>
+                <w:sz w:val="20"/>
+                <w:szCs w:val="20"/>
+              </w:rPr>
+              <w:t xml:space="preserve">Meaning</w:t>
+            </w:r>
+          </w:p>
+        </w:tc>
+      </w:tr>
+      <w:tr>
+        <w:tc>
+          <w:tcPr>
+            <w:tcW w:type="dxa" w:w="1800"/>
+            <w:tcBorders>
+              <w:top w:val="single" w:color="CCCCCC" w:sz="4"/>
+              <w:left w:val="single" w:color="CCCCCC" w:sz="4"/>
+              <w:bottom w:val="single" w:color="CCCCCC" w:sz="4"/>
+              <w:right w:val="single" w:color="CCCCCC" w:sz="4"/>
+            </w:tcBorders>
+            <w:shd w:fill="FFFFFF" w:val="clear"/>
+            <w:tcMar>
+              <w:top w:type="dxa" w:w="80"/>
+              <w:left w:type="dxa" w:w="120"/>
+              <w:bottom w:type="dxa" w:w="80"/>
+              <w:right w:type="dxa" w:w="120"/>
+            </w:tcMar>
+          </w:tcPr>
+          <w:p>
+            <w:r>
+              <w:rPr>
+                <w:rFonts w:ascii="Arial" w:cs="Arial" w:eastAsia="Arial" w:hAnsi="Arial"/>
+                <w:color w:val="1A1A1A"/>
+                <w:sz w:val="20"/>
+                <w:szCs w:val="20"/>
+              </w:rPr>
+              <w:t xml:space="preserve">NORMAL</w:t>
+            </w:r>
+          </w:p>
+        </w:tc>
+        <w:tc>
+          <w:tcPr>
+            <w:tcW w:type="dxa" w:w="3680"/>
+            <w:tcBorders>
+              <w:top w:val="single" w:color="CCCCCC" w:sz="4"/>
+              <w:left w:val="single" w:color="CCCCCC" w:sz="4"/>
+              <w:bottom w:val="single" w:color="CCCCCC" w:sz="4"/>
+              <w:right w:val="single" w:color="CCCCCC" w:sz="4"/>
+            </w:tcBorders>
+            <w:shd w:fill="FFFFFF" w:val="clear"/>
+            <w:tcMar>
+              <w:top w:type="dxa" w:w="80"/>
+              <w:left w:type="dxa" w:w="120"/>
+              <w:bottom w:type="dxa" w:w="80"/>
+              <w:right w:type="dxa" w:w="120"/>
+            </w:tcMar>
+          </w:tcPr>
+          <w:p>
+            <w:r>
+              <w:rPr>
+                <w:rFonts w:ascii="Arial" w:cs="Arial" w:eastAsia="Arial" w:hAnsi="Arial"/>
+                <w:color w:val="1A1A1A"/>
+                <w:sz w:val="20"/>
+                <w:szCs w:val="20"/>
+              </w:rPr>
+              <w:t xml:space="preserve">any ID except 248/249</w:t>
+            </w:r>
+          </w:p>
+        </w:tc>
+        <w:tc>
+          <w:tcPr>
+            <w:tcW w:type="dxa" w:w="4600"/>
+            <w:tcBorders>
+              <w:top w:val="single" w:color="CCCCCC" w:sz="4"/>
+              <w:left w:val="single" w:color="CCCCCC" w:sz="4"/>
+              <w:bottom w:val="single" w:color="CCCCCC" w:sz="4"/>
+              <w:right w:val="single" w:color="CCCCCC" w:sz="4"/>
+            </w:tcBorders>
+            <w:shd w:fill="FFFFFF" w:val="clear"/>
+            <w:tcMar>
+              <w:top w:type="dxa" w:w="80"/>
+              <w:left w:type="dxa" w:w="120"/>
+              <w:bottom w:type="dxa" w:w="80"/>
+              <w:right w:type="dxa" w:w="120"/>
+            </w:tcMar>
+          </w:tcPr>
+          <w:p>
+            <w:r>
+              <w:rPr>
+                <w:rFonts w:ascii="Arial" w:cs="Arial" w:eastAsia="Arial" w:hAnsi="Arial"/>
+                <w:color w:val="1A1A1A"/>
+                <w:sz w:val="20"/>
+                <w:szCs w:val="20"/>
+              </w:rPr>
+              <w:t xml:space="preserve">Reached row end -&gt; U-turn into next row</w:t>
+            </w:r>
+          </w:p>
+        </w:tc>
+      </w:tr>
+      <w:tr>
+        <w:tc>
+          <w:tcPr>
+            <w:tcW w:type="dxa" w:w="1800"/>
+            <w:tcBorders>
+              <w:top w:val="single" w:color="CCCCCC" w:sz="4"/>
+              <w:left w:val="single" w:color="CCCCCC" w:sz="4"/>
+              <w:bottom w:val="single" w:color="CCCCCC" w:sz="4"/>
+              <w:right w:val="single" w:color="CCCCCC" w:sz="4"/>
+            </w:tcBorders>
+            <w:shd w:fill="F2F2F2" w:val="clear"/>
+            <w:tcMar>
+              <w:top w:type="dxa" w:w="80"/>
+              <w:left w:type="dxa" w:w="120"/>
+              <w:bottom w:type="dxa" w:w="80"/>
+              <w:right w:type="dxa" w:w="120"/>
+            </w:tcMar>
+          </w:tcPr>
+          <w:p>
+            <w:r>
+              <w:rPr>
+                <w:rFonts w:ascii="Arial" w:cs="Arial" w:eastAsia="Arial" w:hAnsi="Arial"/>
+                <w:color w:val="1A1A1A"/>
+                <w:sz w:val="20"/>
+                <w:szCs w:val="20"/>
+              </w:rPr>
+              <w:t xml:space="preserve">LAST-ROW</w:t>
+            </w:r>
+          </w:p>
+        </w:tc>
+        <w:tc>
+          <w:tcPr>
+            <w:tcW w:type="dxa" w:w="3680"/>
+            <w:tcBorders>
+              <w:top w:val="single" w:color="CCCCCC" w:sz="4"/>
+              <w:left w:val="single" w:color="CCCCCC" w:sz="4"/>
+              <w:bottom w:val="single" w:color="CCCCCC" w:sz="4"/>
+              <w:right w:val="single" w:color="CCCCCC" w:sz="4"/>
+            </w:tcBorders>
+            <w:shd w:fill="F2F2F2" w:val="clear"/>
+            <w:tcMar>
+              <w:top w:type="dxa" w:w="80"/>
+              <w:left w:type="dxa" w:w="120"/>
+              <w:bottom w:type="dxa" w:w="80"/>
+              <w:right w:type="dxa" w:w="120"/>
+            </w:tcMar>
+          </w:tcPr>
+          <w:p>
+            <w:r>
+              <w:rPr>
+                <w:rFonts w:ascii="Arial" w:cs="Arial" w:eastAsia="Arial" w:hAnsi="Arial"/>
+                <w:color w:val="1A1A1A"/>
+                <w:sz w:val="20"/>
+                <w:szCs w:val="20"/>
+              </w:rPr>
+              <w:t xml:space="preserve">249 (or barcode 'LAST-ROW')</w:t>
+            </w:r>
+          </w:p>
+        </w:tc>
+        <w:tc>
+          <w:tcPr>
+            <w:tcW w:type="dxa" w:w="4600"/>
+            <w:tcBorders>
+              <w:top w:val="single" w:color="CCCCCC" w:sz="4"/>
+              <w:left w:val="single" w:color="CCCCCC" w:sz="4"/>
+              <w:bottom w:val="single" w:color="CCCCCC" w:sz="4"/>
+              <w:right w:val="single" w:color="CCCCCC" w:sz="4"/>
+            </w:tcBorders>
+            <w:shd w:fill="F2F2F2" w:val="clear"/>
+            <w:tcMar>
+              <w:top w:type="dxa" w:w="80"/>
+              <w:left w:type="dxa" w:w="120"/>
+              <w:bottom w:type="dxa" w:w="80"/>
+              <w:right w:type="dxa" w:w="120"/>
+            </w:tcMar>
+          </w:tcPr>
+          <w:p>
+            <w:r>
+              <w:rPr>
+                <w:rFonts w:ascii="Arial" w:cs="Arial" w:eastAsia="Arial" w:hAnsi="Arial"/>
+                <w:color w:val="1A1A1A"/>
+                <w:sz w:val="20"/>
+                <w:szCs w:val="20"/>
+              </w:rPr>
+              <w:t xml:space="preserve">Final U-turn, then watch for STOP</w:t>
+            </w:r>
+          </w:p>
+        </w:tc>
+      </w:tr>
+      <w:tr>
+        <w:tc>
+          <w:tcPr>
+            <w:tcW w:type="dxa" w:w="1800"/>
+            <w:tcBorders>
+              <w:top w:val="single" w:color="CCCCCC" w:sz="4"/>
+              <w:left w:val="single" w:color="CCCCCC" w:sz="4"/>
+              <w:bottom w:val="single" w:color="CCCCCC" w:sz="4"/>
+              <w:right w:val="single" w:color="CCCCCC" w:sz="4"/>
+            </w:tcBorders>
+            <w:shd w:fill="FFFFFF" w:val="clear"/>
+            <w:tcMar>
+              <w:top w:type="dxa" w:w="80"/>
+              <w:left w:type="dxa" w:w="120"/>
+              <w:bottom w:type="dxa" w:w="80"/>
+              <w:right w:type="dxa" w:w="120"/>
+            </w:tcMar>
+          </w:tcPr>
+          <w:p>
+            <w:r>
+              <w:rPr>
+                <w:rFonts w:ascii="Arial" w:cs="Arial" w:eastAsia="Arial" w:hAnsi="Arial"/>
+                <w:color w:val="1A1A1A"/>
+                <w:sz w:val="20"/>
+                <w:szCs w:val="20"/>
+              </w:rPr>
+              <w:t xml:space="preserve">STOP</w:t>
+            </w:r>
+          </w:p>
+        </w:tc>
+        <w:tc>
+          <w:tcPr>
+            <w:tcW w:type="dxa" w:w="3680"/>
+            <w:tcBorders>
+              <w:top w:val="single" w:color="CCCCCC" w:sz="4"/>
+              <w:left w:val="single" w:color="CCCCCC" w:sz="4"/>
+              <w:bottom w:val="single" w:color="CCCCCC" w:sz="4"/>
+              <w:right w:val="single" w:color="CCCCCC" w:sz="4"/>
+            </w:tcBorders>
+            <w:shd w:fill="FFFFFF" w:val="clear"/>
+            <w:tcMar>
+              <w:top w:type="dxa" w:w="80"/>
+              <w:left w:type="dxa" w:w="120"/>
+              <w:bottom w:type="dxa" w:w="80"/>
+              <w:right w:type="dxa" w:w="120"/>
+            </w:tcMar>
+          </w:tcPr>
+          <w:p>
+            <w:r>
+              <w:rPr>
+                <w:rFonts w:ascii="Arial" w:cs="Arial" w:eastAsia="Arial" w:hAnsi="Arial"/>
+                <w:color w:val="1A1A1A"/>
+                <w:sz w:val="20"/>
+                <w:szCs w:val="20"/>
+              </w:rPr>
+              <w:t xml:space="preserve">248 (or barcode 'STOP')</w:t>
+            </w:r>
+          </w:p>
+        </w:tc>
+        <w:tc>
+          <w:tcPr>
+            <w:tcW w:type="dxa" w:w="4600"/>
+            <w:tcBorders>
+              <w:top w:val="single" w:color="CCCCCC" w:sz="4"/>
+              <w:left w:val="single" w:color="CCCCCC" w:sz="4"/>
+              <w:bottom w:val="single" w:color="CCCCCC" w:sz="4"/>
+              <w:right w:val="single" w:color="CCCCCC" w:sz="4"/>
+            </w:tcBorders>
+            <w:shd w:fill="FFFFFF" w:val="clear"/>
+            <w:tcMar>
+              <w:top w:type="dxa" w:w="80"/>
+              <w:left w:type="dxa" w:w="120"/>
+              <w:bottom w:type="dxa" w:w="80"/>
+              <w:right w:type="dxa" w:w="120"/>
+            </w:tcMar>
+          </w:tcPr>
+          <w:p>
+            <w:r>
+              <w:rPr>
+                <w:rFonts w:ascii="Arial" w:cs="Arial" w:eastAsia="Arial" w:hAnsi="Arial"/>
+                <w:color w:val="1A1A1A"/>
+                <w:sz w:val="20"/>
+                <w:szCs w:val="20"/>
+              </w:rPr>
+              <w:t xml:space="preserve">Field complete -&gt; machine halts permanently</w:t>
+            </w:r>
+          </w:p>
+        </w:tc>
+      </w:tr>
+    </w:tbl>
+    <w:p>
+      <w:pPr>
+        <w:spacing w:after="0" w:before="60"/>
+      </w:pPr>
+    </w:p>
+    <w:p>
+      <w:pPr>
+        <w:pStyle w:val="Heading3"/>
+        <w:spacing w:after="60" w:before="200"/>
+      </w:pPr>
+      <w:r>
+        <w:rPr>
+          <w:rFonts w:ascii="Arial" w:cs="Arial" w:eastAsia="Arial" w:hAnsi="Arial"/>
+          <w:b/>
+          <w:bCs/>
+          <w:color w:val="1F4E79"/>
+          <w:sz w:val="24"/>
+          <w:szCs w:val="24"/>
+        </w:rPr>
         <w:t xml:space="preserve">Print and mount guidelines</w:t>
       </w:r>
     </w:p>
@@ -6813,7 +8277,7 @@
           <w:sz w:val="22"/>
           <w:szCs w:val="22"/>
         </w:rPr>
-        <w:t xml:space="preserve">Mount perpendicular to the robot's travel direction at each row end</w:t>
+        <w:t xml:space="preserve">Place one marker at each row end; LAST-ROW at the far end of the last row, STOP at the near end of the last row</w:t>
       </w:r>
     </w:p>
     <w:p>
@@ -6832,7 +8296,7 @@
           <w:sz w:val="22"/>
           <w:szCs w:val="22"/>
         </w:rPr>
-        <w:t xml:space="preserve">Height: centre of marker at camera height +/- 10 cm</w:t>
+        <w:t xml:space="preserve">Mounting option A — centred: marker faces straight down the path (best, 0 deg viewing angle)</w:t>
       </w:r>
     </w:p>
     <w:p>
@@ -6851,7 +8315,45 @@
           <w:sz w:val="22"/>
           <w:szCs w:val="22"/>
         </w:rPr>
-        <w:t xml:space="preserve">Marker ID 0 is reserved as the primary turn trigger</w:t>
+        <w:t xml:space="preserve">Mounting option B — side pole: angle the marker ~45 deg toward the oncoming machine (ArUco reads up to ~65 deg; never mount perpendicular)</w:t>
+      </w:r>
+    </w:p>
+    <w:p>
+      <w:pPr>
+        <w:pStyle w:val="ListParagraph"/>
+        <w:numPr>
+          <w:ilvl w:val="0"/>
+          <w:numId w:val="2"/>
+        </w:numPr>
+        <w:spacing w:after="40" w:before="40"/>
+      </w:pPr>
+      <w:r>
+        <w:rPr>
+          <w:rFonts w:ascii="Arial" w:cs="Arial" w:eastAsia="Arial" w:hAnsi="Arial"/>
+          <w:color w:val="1A1A1A"/>
+          <w:sz w:val="22"/>
+          <w:szCs w:val="22"/>
+        </w:rPr>
+        <w:t xml:space="preserve">Height: centre of marker at camera height +/- 10 cm</w:t>
+      </w:r>
+    </w:p>
+    <w:p>
+      <w:pPr>
+        <w:pStyle w:val="ListParagraph"/>
+        <w:numPr>
+          <w:ilvl w:val="0"/>
+          <w:numId w:val="2"/>
+        </w:numPr>
+        <w:spacing w:after="40" w:before="40"/>
+      </w:pPr>
+      <w:r>
+        <w:rPr>
+          <w:rFonts w:ascii="Arial" w:cs="Arial" w:eastAsia="Arial" w:hAnsi="Arial"/>
+          <w:color w:val="1A1A1A"/>
+          <w:sz w:val="22"/>
+          <w:szCs w:val="22"/>
+        </w:rPr>
+        <w:t xml:space="preserve">Use ArUco (not 1D barcodes) for any angled/side mounting</w:t>
       </w:r>
     </w:p>
     <w:p>
@@ -7003,7 +8505,933 @@
           <w:sz w:val="36"/>
           <w:szCs w:val="36"/>
         </w:rPr>
-        <w:t xml:space="preserve">Phase 5 — Integration Testing (Bench)</w:t>
+        <w:t xml:space="preserve">Phase 5 — Side Sensor Installation (Lane-Keeping)</w:t>
+      </w:r>
+    </w:p>
+    <w:p>
+      <w:pPr>
+        <w:spacing w:after="0" w:before="60"/>
+      </w:pPr>
+    </w:p>
+    <w:p>
+      <w:pPr>
+        <w:spacing w:after="60" w:before="60"/>
+      </w:pPr>
+      <w:r>
+        <w:rPr>
+          <w:rFonts w:ascii="Arial" w:cs="Arial" w:eastAsia="Arial" w:hAnsi="Arial"/>
+          <w:color w:val="1A1A1A"/>
+          <w:sz w:val="22"/>
+          <w:szCs w:val="22"/>
+        </w:rPr>
+        <w:t xml:space="preserve">Two distance sensors (one per side) keep the machine centred between the crop rows. They continuously measure the clear gap to the plants on each side; the controller makes small steering nudges (NOT turns) toward the side with more room.</w:t>
+      </w:r>
+    </w:p>
+    <w:p>
+      <w:pPr>
+        <w:spacing w:after="0" w:before="60"/>
+      </w:pPr>
+    </w:p>
+    <w:p>
+      <w:pPr>
+        <w:pStyle w:val="Heading3"/>
+        <w:spacing w:after="60" w:before="200"/>
+      </w:pPr>
+      <w:r>
+        <w:rPr>
+          <w:rFonts w:ascii="Arial" w:cs="Arial" w:eastAsia="Arial" w:hAnsi="Arial"/>
+          <w:b/>
+          <w:bCs/>
+          <w:color w:val="1F4E79"/>
+          <w:sz w:val="24"/>
+          <w:szCs w:val="24"/>
+        </w:rPr>
+        <w:t xml:space="preserve">Mounting</w:t>
+      </w:r>
+    </w:p>
+    <w:p>
+      <w:pPr>
+        <w:pStyle w:val="ListParagraph"/>
+        <w:numPr>
+          <w:ilvl w:val="0"/>
+          <w:numId w:val="2"/>
+        </w:numPr>
+        <w:spacing w:after="40" w:before="40"/>
+      </w:pPr>
+      <w:r>
+        <w:rPr>
+          <w:rFonts w:ascii="Arial" w:cs="Arial" w:eastAsia="Arial" w:hAnsi="Arial"/>
+          <w:color w:val="1A1A1A"/>
+          <w:sz w:val="22"/>
+          <w:szCs w:val="22"/>
+        </w:rPr>
+        <w:t xml:space="preserve">Mount one sensor on each side of the machine, facing outward (perpendicular to travel), at plant-canopy height</w:t>
+      </w:r>
+    </w:p>
+    <w:p>
+      <w:pPr>
+        <w:pStyle w:val="ListParagraph"/>
+        <w:numPr>
+          <w:ilvl w:val="0"/>
+          <w:numId w:val="2"/>
+        </w:numPr>
+        <w:spacing w:after="40" w:before="40"/>
+      </w:pPr>
+      <w:r>
+        <w:rPr>
+          <w:rFonts w:ascii="Arial" w:cs="Arial" w:eastAsia="Arial" w:hAnsi="Arial"/>
+          <w:color w:val="1A1A1A"/>
+          <w:sz w:val="22"/>
+          <w:szCs w:val="22"/>
+        </w:rPr>
+        <w:t xml:space="preserve">Aim them at the densest, most consistent part of the crop wall</w:t>
+      </w:r>
+    </w:p>
+    <w:p>
+      <w:pPr>
+        <w:pStyle w:val="ListParagraph"/>
+        <w:numPr>
+          <w:ilvl w:val="0"/>
+          <w:numId w:val="2"/>
+        </w:numPr>
+        <w:spacing w:after="40" w:before="40"/>
+      </w:pPr>
+      <w:r>
+        <w:rPr>
+          <w:rFonts w:ascii="Arial" w:cs="Arial" w:eastAsia="Arial" w:hAnsi="Arial"/>
+          <w:color w:val="1A1A1A"/>
+          <w:sz w:val="22"/>
+          <w:szCs w:val="22"/>
+        </w:rPr>
+        <w:t xml:space="preserve">Keep both sensors at the same height and the same fore/aft position so readings are comparable</w:t>
+      </w:r>
+    </w:p>
+    <w:p>
+      <w:pPr>
+        <w:spacing w:after="0" w:before="60"/>
+      </w:pPr>
+    </w:p>
+    <w:p>
+      <w:pPr>
+        <w:pStyle w:val="Heading3"/>
+        <w:spacing w:after="60" w:before="200"/>
+      </w:pPr>
+      <w:r>
+        <w:rPr>
+          <w:rFonts w:ascii="Arial" w:cs="Arial" w:eastAsia="Arial" w:hAnsi="Arial"/>
+          <w:b/>
+          <w:bCs/>
+          <w:color w:val="1F4E79"/>
+          <w:sz w:val="24"/>
+          <w:szCs w:val="24"/>
+        </w:rPr>
+        <w:t xml:space="preserve">Centring logic (already implemented in software)</w:t>
+      </w:r>
+    </w:p>
+    <w:tbl>
+      <w:tblPr>
+        <w:tblW w:type="dxa" w:w="10080"/>
+        <w:tblBorders>
+          <w:top w:val="single" w:color="auto" w:sz="4"/>
+          <w:left w:val="single" w:color="auto" w:sz="4"/>
+          <w:bottom w:val="single" w:color="auto" w:sz="4"/>
+          <w:right w:val="single" w:color="auto" w:sz="4"/>
+          <w:insideH w:val="single" w:color="auto" w:sz="4"/>
+          <w:insideV w:val="single" w:color="auto" w:sz="4"/>
+        </w:tblBorders>
+      </w:tblPr>
+      <w:tblGrid>
+        <w:gridCol w:w="3000"/>
+        <w:gridCol w:w="3480"/>
+        <w:gridCol w:w="3600"/>
+      </w:tblGrid>
+      <w:tr>
+        <w:trPr>
+          <w:tblHeader/>
+        </w:trPr>
+        <w:tc>
+          <w:tcPr>
+            <w:tcW w:type="dxa" w:w="3000"/>
+            <w:tcBorders>
+              <w:top w:val="single" w:color="2E75B6" w:sz="4"/>
+              <w:left w:val="single" w:color="2E75B6" w:sz="4"/>
+              <w:bottom w:val="single" w:color="2E75B6" w:sz="4"/>
+              <w:right w:val="single" w:color="2E75B6" w:sz="4"/>
+            </w:tcBorders>
+            <w:shd w:fill="1F4E79" w:val="clear"/>
+            <w:tcMar>
+              <w:top w:type="dxa" w:w="80"/>
+              <w:left w:type="dxa" w:w="120"/>
+              <w:bottom w:type="dxa" w:w="80"/>
+              <w:right w:type="dxa" w:w="120"/>
+            </w:tcMar>
+            <w:vAlign w:val="center"/>
+          </w:tcPr>
+          <w:p>
+            <w:r>
+              <w:rPr>
+                <w:rFonts w:ascii="Arial" w:cs="Arial" w:eastAsia="Arial" w:hAnsi="Arial"/>
+                <w:b/>
+                <w:bCs/>
+                <w:color w:val="FFFFFF"/>
+                <w:sz w:val="20"/>
+                <w:szCs w:val="20"/>
+              </w:rPr>
+              <w:t xml:space="preserve">Sensor reading</w:t>
+            </w:r>
+          </w:p>
+        </w:tc>
+        <w:tc>
+          <w:tcPr>
+            <w:tcW w:type="dxa" w:w="3480"/>
+            <w:tcBorders>
+              <w:top w:val="single" w:color="2E75B6" w:sz="4"/>
+              <w:left w:val="single" w:color="2E75B6" w:sz="4"/>
+              <w:bottom w:val="single" w:color="2E75B6" w:sz="4"/>
+              <w:right w:val="single" w:color="2E75B6" w:sz="4"/>
+            </w:tcBorders>
+            <w:shd w:fill="1F4E79" w:val="clear"/>
+            <w:tcMar>
+              <w:top w:type="dxa" w:w="80"/>
+              <w:left w:type="dxa" w:w="120"/>
+              <w:bottom w:type="dxa" w:w="80"/>
+              <w:right w:type="dxa" w:w="120"/>
+            </w:tcMar>
+            <w:vAlign w:val="center"/>
+          </w:tcPr>
+          <w:p>
+            <w:r>
+              <w:rPr>
+                <w:rFonts w:ascii="Arial" w:cs="Arial" w:eastAsia="Arial" w:hAnsi="Arial"/>
+                <w:b/>
+                <w:bCs/>
+                <w:color w:val="FFFFFF"/>
+                <w:sz w:val="20"/>
+                <w:szCs w:val="20"/>
+              </w:rPr>
+              <w:t xml:space="preserve">Meaning</w:t>
+            </w:r>
+          </w:p>
+        </w:tc>
+        <w:tc>
+          <w:tcPr>
+            <w:tcW w:type="dxa" w:w="3600"/>
+            <w:tcBorders>
+              <w:top w:val="single" w:color="2E75B6" w:sz="4"/>
+              <w:left w:val="single" w:color="2E75B6" w:sz="4"/>
+              <w:bottom w:val="single" w:color="2E75B6" w:sz="4"/>
+              <w:right w:val="single" w:color="2E75B6" w:sz="4"/>
+            </w:tcBorders>
+            <w:shd w:fill="1F4E79" w:val="clear"/>
+            <w:tcMar>
+              <w:top w:type="dxa" w:w="80"/>
+              <w:left w:type="dxa" w:w="120"/>
+              <w:bottom w:type="dxa" w:w="80"/>
+              <w:right w:type="dxa" w:w="120"/>
+            </w:tcMar>
+            <w:vAlign w:val="center"/>
+          </w:tcPr>
+          <w:p>
+            <w:r>
+              <w:rPr>
+                <w:rFonts w:ascii="Arial" w:cs="Arial" w:eastAsia="Arial" w:hAnsi="Arial"/>
+                <w:b/>
+                <w:bCs/>
+                <w:color w:val="FFFFFF"/>
+                <w:sz w:val="20"/>
+                <w:szCs w:val="20"/>
+              </w:rPr>
+              <w:t xml:space="preserve">Action</w:t>
+            </w:r>
+          </w:p>
+        </w:tc>
+      </w:tr>
+      <w:tr>
+        <w:tc>
+          <w:tcPr>
+            <w:tcW w:type="dxa" w:w="3000"/>
+            <w:tcBorders>
+              <w:top w:val="single" w:color="CCCCCC" w:sz="4"/>
+              <w:left w:val="single" w:color="CCCCCC" w:sz="4"/>
+              <w:bottom w:val="single" w:color="CCCCCC" w:sz="4"/>
+              <w:right w:val="single" w:color="CCCCCC" w:sz="4"/>
+            </w:tcBorders>
+            <w:shd w:fill="FFFFFF" w:val="clear"/>
+            <w:tcMar>
+              <w:top w:type="dxa" w:w="80"/>
+              <w:left w:type="dxa" w:w="120"/>
+              <w:bottom w:type="dxa" w:w="80"/>
+              <w:right w:type="dxa" w:w="120"/>
+            </w:tcMar>
+          </w:tcPr>
+          <w:p>
+            <w:r>
+              <w:rPr>
+                <w:rFonts w:ascii="Arial" w:cs="Arial" w:eastAsia="Arial" w:hAnsi="Arial"/>
+                <w:color w:val="1A1A1A"/>
+                <w:sz w:val="20"/>
+                <w:szCs w:val="20"/>
+              </w:rPr>
+              <w:t xml:space="preserve">Right gap &lt; Left gap</w:t>
+            </w:r>
+          </w:p>
+        </w:tc>
+        <w:tc>
+          <w:tcPr>
+            <w:tcW w:type="dxa" w:w="3480"/>
+            <w:tcBorders>
+              <w:top w:val="single" w:color="CCCCCC" w:sz="4"/>
+              <w:left w:val="single" w:color="CCCCCC" w:sz="4"/>
+              <w:bottom w:val="single" w:color="CCCCCC" w:sz="4"/>
+              <w:right w:val="single" w:color="CCCCCC" w:sz="4"/>
+            </w:tcBorders>
+            <w:shd w:fill="FFFFFF" w:val="clear"/>
+            <w:tcMar>
+              <w:top w:type="dxa" w:w="80"/>
+              <w:left w:type="dxa" w:w="120"/>
+              <w:bottom w:type="dxa" w:w="80"/>
+              <w:right w:type="dxa" w:w="120"/>
+            </w:tcMar>
+          </w:tcPr>
+          <w:p>
+            <w:r>
+              <w:rPr>
+                <w:rFonts w:ascii="Arial" w:cs="Arial" w:eastAsia="Arial" w:hAnsi="Arial"/>
+                <w:color w:val="1A1A1A"/>
+                <w:sz w:val="20"/>
+                <w:szCs w:val="20"/>
+              </w:rPr>
+              <w:t xml:space="preserve">Machine too far right</w:t>
+            </w:r>
+          </w:p>
+        </w:tc>
+        <w:tc>
+          <w:tcPr>
+            <w:tcW w:type="dxa" w:w="3600"/>
+            <w:tcBorders>
+              <w:top w:val="single" w:color="CCCCCC" w:sz="4"/>
+              <w:left w:val="single" w:color="CCCCCC" w:sz="4"/>
+              <w:bottom w:val="single" w:color="CCCCCC" w:sz="4"/>
+              <w:right w:val="single" w:color="CCCCCC" w:sz="4"/>
+            </w:tcBorders>
+            <w:shd w:fill="FFFFFF" w:val="clear"/>
+            <w:tcMar>
+              <w:top w:type="dxa" w:w="80"/>
+              <w:left w:type="dxa" w:w="120"/>
+              <w:bottom w:type="dxa" w:w="80"/>
+              <w:right w:type="dxa" w:w="120"/>
+            </w:tcMar>
+          </w:tcPr>
+          <w:p>
+            <w:r>
+              <w:rPr>
+                <w:rFonts w:ascii="Arial" w:cs="Arial" w:eastAsia="Arial" w:hAnsi="Arial"/>
+                <w:color w:val="1A1A1A"/>
+                <w:sz w:val="20"/>
+                <w:szCs w:val="20"/>
+              </w:rPr>
+              <w:t xml:space="preserve">Steer LEFT a little</w:t>
+            </w:r>
+          </w:p>
+        </w:tc>
+      </w:tr>
+      <w:tr>
+        <w:tc>
+          <w:tcPr>
+            <w:tcW w:type="dxa" w:w="3000"/>
+            <w:tcBorders>
+              <w:top w:val="single" w:color="CCCCCC" w:sz="4"/>
+              <w:left w:val="single" w:color="CCCCCC" w:sz="4"/>
+              <w:bottom w:val="single" w:color="CCCCCC" w:sz="4"/>
+              <w:right w:val="single" w:color="CCCCCC" w:sz="4"/>
+            </w:tcBorders>
+            <w:shd w:fill="F2F2F2" w:val="clear"/>
+            <w:tcMar>
+              <w:top w:type="dxa" w:w="80"/>
+              <w:left w:type="dxa" w:w="120"/>
+              <w:bottom w:type="dxa" w:w="80"/>
+              <w:right w:type="dxa" w:w="120"/>
+            </w:tcMar>
+          </w:tcPr>
+          <w:p>
+            <w:r>
+              <w:rPr>
+                <w:rFonts w:ascii="Arial" w:cs="Arial" w:eastAsia="Arial" w:hAnsi="Arial"/>
+                <w:color w:val="1A1A1A"/>
+                <w:sz w:val="20"/>
+                <w:szCs w:val="20"/>
+              </w:rPr>
+              <w:t xml:space="preserve">Left gap &lt; Right gap</w:t>
+            </w:r>
+          </w:p>
+        </w:tc>
+        <w:tc>
+          <w:tcPr>
+            <w:tcW w:type="dxa" w:w="3480"/>
+            <w:tcBorders>
+              <w:top w:val="single" w:color="CCCCCC" w:sz="4"/>
+              <w:left w:val="single" w:color="CCCCCC" w:sz="4"/>
+              <w:bottom w:val="single" w:color="CCCCCC" w:sz="4"/>
+              <w:right w:val="single" w:color="CCCCCC" w:sz="4"/>
+            </w:tcBorders>
+            <w:shd w:fill="F2F2F2" w:val="clear"/>
+            <w:tcMar>
+              <w:top w:type="dxa" w:w="80"/>
+              <w:left w:type="dxa" w:w="120"/>
+              <w:bottom w:type="dxa" w:w="80"/>
+              <w:right w:type="dxa" w:w="120"/>
+            </w:tcMar>
+          </w:tcPr>
+          <w:p>
+            <w:r>
+              <w:rPr>
+                <w:rFonts w:ascii="Arial" w:cs="Arial" w:eastAsia="Arial" w:hAnsi="Arial"/>
+                <w:color w:val="1A1A1A"/>
+                <w:sz w:val="20"/>
+                <w:szCs w:val="20"/>
+              </w:rPr>
+              <w:t xml:space="preserve">Machine too far left</w:t>
+            </w:r>
+          </w:p>
+        </w:tc>
+        <w:tc>
+          <w:tcPr>
+            <w:tcW w:type="dxa" w:w="3600"/>
+            <w:tcBorders>
+              <w:top w:val="single" w:color="CCCCCC" w:sz="4"/>
+              <w:left w:val="single" w:color="CCCCCC" w:sz="4"/>
+              <w:bottom w:val="single" w:color="CCCCCC" w:sz="4"/>
+              <w:right w:val="single" w:color="CCCCCC" w:sz="4"/>
+            </w:tcBorders>
+            <w:shd w:fill="F2F2F2" w:val="clear"/>
+            <w:tcMar>
+              <w:top w:type="dxa" w:w="80"/>
+              <w:left w:type="dxa" w:w="120"/>
+              <w:bottom w:type="dxa" w:w="80"/>
+              <w:right w:type="dxa" w:w="120"/>
+            </w:tcMar>
+          </w:tcPr>
+          <w:p>
+            <w:r>
+              <w:rPr>
+                <w:rFonts w:ascii="Arial" w:cs="Arial" w:eastAsia="Arial" w:hAnsi="Arial"/>
+                <w:color w:val="1A1A1A"/>
+                <w:sz w:val="20"/>
+                <w:szCs w:val="20"/>
+              </w:rPr>
+              <w:t xml:space="preserve">Steer RIGHT a little</w:t>
+            </w:r>
+          </w:p>
+        </w:tc>
+      </w:tr>
+      <w:tr>
+        <w:tc>
+          <w:tcPr>
+            <w:tcW w:type="dxa" w:w="3000"/>
+            <w:tcBorders>
+              <w:top w:val="single" w:color="CCCCCC" w:sz="4"/>
+              <w:left w:val="single" w:color="CCCCCC" w:sz="4"/>
+              <w:bottom w:val="single" w:color="CCCCCC" w:sz="4"/>
+              <w:right w:val="single" w:color="CCCCCC" w:sz="4"/>
+            </w:tcBorders>
+            <w:shd w:fill="FFFFFF" w:val="clear"/>
+            <w:tcMar>
+              <w:top w:type="dxa" w:w="80"/>
+              <w:left w:type="dxa" w:w="120"/>
+              <w:bottom w:type="dxa" w:w="80"/>
+              <w:right w:type="dxa" w:w="120"/>
+            </w:tcMar>
+          </w:tcPr>
+          <w:p>
+            <w:r>
+              <w:rPr>
+                <w:rFonts w:ascii="Arial" w:cs="Arial" w:eastAsia="Arial" w:hAnsi="Arial"/>
+                <w:color w:val="1A1A1A"/>
+                <w:sz w:val="20"/>
+                <w:szCs w:val="20"/>
+              </w:rPr>
+              <w:t xml:space="preserve">Gaps balanced (within tolerance)</w:t>
+            </w:r>
+          </w:p>
+        </w:tc>
+        <w:tc>
+          <w:tcPr>
+            <w:tcW w:type="dxa" w:w="3480"/>
+            <w:tcBorders>
+              <w:top w:val="single" w:color="CCCCCC" w:sz="4"/>
+              <w:left w:val="single" w:color="CCCCCC" w:sz="4"/>
+              <w:bottom w:val="single" w:color="CCCCCC" w:sz="4"/>
+              <w:right w:val="single" w:color="CCCCCC" w:sz="4"/>
+            </w:tcBorders>
+            <w:shd w:fill="FFFFFF" w:val="clear"/>
+            <w:tcMar>
+              <w:top w:type="dxa" w:w="80"/>
+              <w:left w:type="dxa" w:w="120"/>
+              <w:bottom w:type="dxa" w:w="80"/>
+              <w:right w:type="dxa" w:w="120"/>
+            </w:tcMar>
+          </w:tcPr>
+          <w:p>
+            <w:r>
+              <w:rPr>
+                <w:rFonts w:ascii="Arial" w:cs="Arial" w:eastAsia="Arial" w:hAnsi="Arial"/>
+                <w:color w:val="1A1A1A"/>
+                <w:sz w:val="20"/>
+                <w:szCs w:val="20"/>
+              </w:rPr>
+              <w:t xml:space="preserve">Centred</w:t>
+            </w:r>
+          </w:p>
+        </w:tc>
+        <w:tc>
+          <w:tcPr>
+            <w:tcW w:type="dxa" w:w="3600"/>
+            <w:tcBorders>
+              <w:top w:val="single" w:color="CCCCCC" w:sz="4"/>
+              <w:left w:val="single" w:color="CCCCCC" w:sz="4"/>
+              <w:bottom w:val="single" w:color="CCCCCC" w:sz="4"/>
+              <w:right w:val="single" w:color="CCCCCC" w:sz="4"/>
+            </w:tcBorders>
+            <w:shd w:fill="FFFFFF" w:val="clear"/>
+            <w:tcMar>
+              <w:top w:type="dxa" w:w="80"/>
+              <w:left w:type="dxa" w:w="120"/>
+              <w:bottom w:type="dxa" w:w="80"/>
+              <w:right w:type="dxa" w:w="120"/>
+            </w:tcMar>
+          </w:tcPr>
+          <w:p>
+            <w:r>
+              <w:rPr>
+                <w:rFonts w:ascii="Arial" w:cs="Arial" w:eastAsia="Arial" w:hAnsi="Arial"/>
+                <w:color w:val="1A1A1A"/>
+                <w:sz w:val="20"/>
+                <w:szCs w:val="20"/>
+              </w:rPr>
+              <w:t xml:space="preserve">Drive straight</w:t>
+            </w:r>
+          </w:p>
+        </w:tc>
+      </w:tr>
+    </w:tbl>
+    <w:p>
+      <w:pPr>
+        <w:spacing w:after="0" w:before="60"/>
+      </w:pPr>
+    </w:p>
+    <w:p>
+      <w:pPr>
+        <w:pStyle w:val="Heading3"/>
+        <w:spacing w:after="60" w:before="200"/>
+      </w:pPr>
+      <w:r>
+        <w:rPr>
+          <w:rFonts w:ascii="Arial" w:cs="Arial" w:eastAsia="Arial" w:hAnsi="Arial"/>
+          <w:b/>
+          <w:bCs/>
+          <w:color w:val="1F4E79"/>
+          <w:sz w:val="24"/>
+          <w:szCs w:val="24"/>
+        </w:rPr>
+        <w:t xml:space="preserve">Calibration steps</w:t>
+      </w:r>
+    </w:p>
+    <w:p>
+      <w:pPr>
+        <w:pStyle w:val="ListParagraph"/>
+        <w:numPr>
+          <w:ilvl w:val="0"/>
+          <w:numId w:val="3"/>
+        </w:numPr>
+        <w:spacing w:after="40" w:before="40"/>
+      </w:pPr>
+      <w:r>
+        <w:rPr>
+          <w:rFonts w:ascii="Arial" w:cs="Arial" w:eastAsia="Arial" w:hAnsi="Arial"/>
+          <w:color w:val="1A1A1A"/>
+          <w:sz w:val="22"/>
+          <w:szCs w:val="22"/>
+        </w:rPr>
+        <w:t xml:space="preserve">Park the machine exactly centred in a path by hand; record both sensor readings — they should match (this is the 'balanced' baseline)</w:t>
+      </w:r>
+    </w:p>
+    <w:p>
+      <w:pPr>
+        <w:pStyle w:val="ListParagraph"/>
+        <w:numPr>
+          <w:ilvl w:val="0"/>
+          <w:numId w:val="3"/>
+        </w:numPr>
+        <w:spacing w:after="40" w:before="40"/>
+      </w:pPr>
+      <w:r>
+        <w:rPr>
+          <w:rFonts w:ascii="Arial" w:cs="Arial" w:eastAsia="Arial" w:hAnsi="Arial"/>
+          <w:color w:val="1A1A1A"/>
+          <w:sz w:val="22"/>
+          <w:szCs w:val="22"/>
+        </w:rPr>
+        <w:t xml:space="preserve">Set the balance tolerance (how far off-centre is acceptable before correcting)</w:t>
+      </w:r>
+    </w:p>
+    <w:p>
+      <w:pPr>
+        <w:pStyle w:val="ListParagraph"/>
+        <w:numPr>
+          <w:ilvl w:val="0"/>
+          <w:numId w:val="3"/>
+        </w:numPr>
+        <w:spacing w:after="40" w:before="40"/>
+      </w:pPr>
+      <w:r>
+        <w:rPr>
+          <w:rFonts w:ascii="Arial" w:cs="Arial" w:eastAsia="Arial" w:hAnsi="Arial"/>
+          <w:color w:val="1A1A1A"/>
+          <w:sz w:val="22"/>
+          <w:szCs w:val="22"/>
+        </w:rPr>
+        <w:t xml:space="preserve">Set the steering-nudge gain so corrections are smooth, not jerky</w:t>
+      </w:r>
+    </w:p>
+    <w:p>
+      <w:pPr>
+        <w:pStyle w:val="ListParagraph"/>
+        <w:numPr>
+          <w:ilvl w:val="0"/>
+          <w:numId w:val="3"/>
+        </w:numPr>
+        <w:spacing w:after="40" w:before="40"/>
+      </w:pPr>
+      <w:r>
+        <w:rPr>
+          <w:rFonts w:ascii="Arial" w:cs="Arial" w:eastAsia="Arial" w:hAnsi="Arial"/>
+          <w:color w:val="1A1A1A"/>
+          <w:sz w:val="22"/>
+          <w:szCs w:val="22"/>
+        </w:rPr>
+        <w:t xml:space="preserve">Drive a straight row slowly and confirm the machine holds the centre line</w:t>
+      </w:r>
+    </w:p>
+    <w:p>
+      <w:pPr>
+        <w:spacing w:after="0" w:before="40"/>
+      </w:pPr>
+    </w:p>
+    <w:p>
+      <w:pPr>
+        <w:shd w:fill="FFF3CD" w:val="clear"/>
+        <w:spacing w:after="60" w:before="60"/>
+      </w:pPr>
+      <w:r>
+        <w:rPr>
+          <w:rFonts w:ascii="Arial" w:cs="Arial" w:eastAsia="Arial" w:hAnsi="Arial"/>
+          <w:color w:val="856404"/>
+          <w:sz w:val="22"/>
+          <w:szCs w:val="22"/>
+        </w:rPr>
+        <w:t xml:space="preserve">  NOTE: The simulation (python simulation/field_simulator.py) shows this live — the 'Side sensors (centring)' panel displays Left gap, Right gap and the STEER LEFT/RIGHT/CENTRED action.</w:t>
+      </w:r>
+    </w:p>
+    <w:p>
+      <w:pPr>
+        <w:spacing w:after="0" w:before="120"/>
+      </w:pPr>
+    </w:p>
+    <w:p>
+      <w:pPr>
+        <w:pStyle w:val="Heading1"/>
+        <w:shd w:fill="1F4E79" w:val="clear"/>
+        <w:spacing w:after="120" w:before="360"/>
+        <w:ind w:left="120" w:right="120"/>
+      </w:pPr>
+      <w:r>
+        <w:rPr>
+          <w:rFonts w:ascii="Arial" w:cs="Arial" w:eastAsia="Arial" w:hAnsi="Arial"/>
+          <w:b/>
+          <w:bCs/>
+          <w:color w:val="FFFFFF"/>
+          <w:sz w:val="36"/>
+          <w:szCs w:val="36"/>
+        </w:rPr>
+        <w:t xml:space="preserve">Phase 6 — U-Turn Calibration &amp; Sensor-Confirmed Re-Entry</w:t>
+      </w:r>
+    </w:p>
+    <w:p>
+      <w:pPr>
+        <w:spacing w:after="0" w:before="60"/>
+      </w:pPr>
+    </w:p>
+    <w:p>
+      <w:pPr>
+        <w:spacing w:after="60" w:before="60"/>
+      </w:pPr>
+      <w:r>
+        <w:rPr>
+          <w:rFonts w:ascii="Arial" w:cs="Arial" w:eastAsia="Arial" w:hAnsi="Arial"/>
+          <w:color w:val="1A1A1A"/>
+          <w:sz w:val="22"/>
+          <w:szCs w:val="22"/>
+        </w:rPr>
+        <w:t xml:space="preserve">The camera + marker only tell the machine WHEN to turn. HOW MUCH to turn is a fixed, pre-calibrated manoeuvre sized to the row spacing — the software does not compute the turn curve, it just sends the U_TURN command. The steering controller executes the calibrated arc, then the side sensors confirm the machine has re-entered the next row.</w:t>
+      </w:r>
+    </w:p>
+    <w:p>
+      <w:pPr>
+        <w:spacing w:after="0" w:before="60"/>
+      </w:pPr>
+    </w:p>
+    <w:p>
+      <w:pPr>
+        <w:pStyle w:val="Heading3"/>
+        <w:spacing w:after="60" w:before="200"/>
+      </w:pPr>
+      <w:r>
+        <w:rPr>
+          <w:rFonts w:ascii="Arial" w:cs="Arial" w:eastAsia="Arial" w:hAnsi="Arial"/>
+          <w:b/>
+          <w:bCs/>
+          <w:color w:val="1F4E79"/>
+          <w:sz w:val="24"/>
+          <w:szCs w:val="24"/>
+        </w:rPr>
+        <w:t xml:space="preserve">Why calibration is needed</w:t>
+      </w:r>
+    </w:p>
+    <w:p>
+      <w:pPr>
+        <w:pStyle w:val="ListParagraph"/>
+        <w:numPr>
+          <w:ilvl w:val="0"/>
+          <w:numId w:val="2"/>
+        </w:numPr>
+        <w:spacing w:after="40" w:before="40"/>
+      </w:pPr>
+      <w:r>
+        <w:rPr>
+          <w:rFonts w:ascii="Arial" w:cs="Arial" w:eastAsia="Arial" w:hAnsi="Arial"/>
+          <w:color w:val="1A1A1A"/>
+          <w:sz w:val="22"/>
+          <w:szCs w:val="22"/>
+        </w:rPr>
+        <w:t xml:space="preserve">A U-turn must move the machine sideways by exactly one row spacing and reverse heading 180 degrees</w:t>
+      </w:r>
+    </w:p>
+    <w:p>
+      <w:pPr>
+        <w:pStyle w:val="ListParagraph"/>
+        <w:numPr>
+          <w:ilvl w:val="0"/>
+          <w:numId w:val="2"/>
+        </w:numPr>
+        <w:spacing w:after="40" w:before="40"/>
+      </w:pPr>
+      <w:r>
+        <w:rPr>
+          <w:rFonts w:ascii="Arial" w:cs="Arial" w:eastAsia="Arial" w:hAnsi="Arial"/>
+          <w:color w:val="1A1A1A"/>
+          <w:sz w:val="22"/>
+          <w:szCs w:val="22"/>
+        </w:rPr>
+        <w:t xml:space="preserve">Row spacing is a fixed constant for a given field — measure it once</w:t>
+      </w:r>
+    </w:p>
+    <w:p>
+      <w:pPr>
+        <w:pStyle w:val="ListParagraph"/>
+        <w:numPr>
+          <w:ilvl w:val="0"/>
+          <w:numId w:val="2"/>
+        </w:numPr>
+        <w:spacing w:after="40" w:before="40"/>
+      </w:pPr>
+      <w:r>
+        <w:rPr>
+          <w:rFonts w:ascii="Arial" w:cs="Arial" w:eastAsia="Arial" w:hAnsi="Arial"/>
+          <w:color w:val="1A1A1A"/>
+          <w:sz w:val="22"/>
+          <w:szCs w:val="22"/>
+        </w:rPr>
+        <w:t xml:space="preserve">If row spacing &gt;= 2x turning radius: a simple half-circle works</w:t>
+      </w:r>
+    </w:p>
+    <w:p>
+      <w:pPr>
+        <w:pStyle w:val="ListParagraph"/>
+        <w:numPr>
+          <w:ilvl w:val="0"/>
+          <w:numId w:val="2"/>
+        </w:numPr>
+        <w:spacing w:after="40" w:before="40"/>
+      </w:pPr>
+      <w:r>
+        <w:rPr>
+          <w:rFonts w:ascii="Arial" w:cs="Arial" w:eastAsia="Arial" w:hAnsi="Arial"/>
+          <w:color w:val="1A1A1A"/>
+          <w:sz w:val="22"/>
+          <w:szCs w:val="22"/>
+        </w:rPr>
+        <w:t xml:space="preserve">If rows are narrower than the turning radius: use an Omega / keyhole turn (overshoot, reverse, swing in)</w:t>
+      </w:r>
+    </w:p>
+    <w:p>
+      <w:pPr>
+        <w:spacing w:after="0" w:before="60"/>
+      </w:pPr>
+    </w:p>
+    <w:p>
+      <w:pPr>
+        <w:pStyle w:val="Heading3"/>
+        <w:spacing w:after="60" w:before="200"/>
+      </w:pPr>
+      <w:r>
+        <w:rPr>
+          <w:rFonts w:ascii="Arial" w:cs="Arial" w:eastAsia="Arial" w:hAnsi="Arial"/>
+          <w:b/>
+          <w:bCs/>
+          <w:color w:val="1F4E79"/>
+          <w:sz w:val="24"/>
+          <w:szCs w:val="24"/>
+        </w:rPr>
+        <w:t xml:space="preserve">Calibration steps</w:t>
+      </w:r>
+    </w:p>
+    <w:p>
+      <w:pPr>
+        <w:pStyle w:val="ListParagraph"/>
+        <w:numPr>
+          <w:ilvl w:val="0"/>
+          <w:numId w:val="3"/>
+        </w:numPr>
+        <w:spacing w:after="40" w:before="40"/>
+      </w:pPr>
+      <w:r>
+        <w:rPr>
+          <w:rFonts w:ascii="Arial" w:cs="Arial" w:eastAsia="Arial" w:hAnsi="Arial"/>
+          <w:color w:val="1A1A1A"/>
+          <w:sz w:val="22"/>
+          <w:szCs w:val="22"/>
+        </w:rPr>
+        <w:t xml:space="preserve">Measure the exact row spacing (centre-to-centre distance between adjacent paths)</w:t>
+      </w:r>
+    </w:p>
+    <w:p>
+      <w:pPr>
+        <w:pStyle w:val="ListParagraph"/>
+        <w:numPr>
+          <w:ilvl w:val="0"/>
+          <w:numId w:val="3"/>
+        </w:numPr>
+        <w:spacing w:after="40" w:before="40"/>
+      </w:pPr>
+      <w:r>
+        <w:rPr>
+          <w:rFonts w:ascii="Arial" w:cs="Arial" w:eastAsia="Arial" w:hAnsi="Arial"/>
+          <w:color w:val="1A1A1A"/>
+          <w:sz w:val="22"/>
+          <w:szCs w:val="22"/>
+        </w:rPr>
+        <w:t xml:space="preserve">Program the steering controller to execute the U-turn manoeuvre for that spacing when it receives CAN U_TURN (ID 0x123)</w:t>
+      </w:r>
+    </w:p>
+    <w:p>
+      <w:pPr>
+        <w:pStyle w:val="ListParagraph"/>
+        <w:numPr>
+          <w:ilvl w:val="0"/>
+          <w:numId w:val="3"/>
+        </w:numPr>
+        <w:spacing w:after="40" w:before="40"/>
+      </w:pPr>
+      <w:r>
+        <w:rPr>
+          <w:rFonts w:ascii="Arial" w:cs="Arial" w:eastAsia="Arial" w:hAnsi="Arial"/>
+          <w:color w:val="1A1A1A"/>
+          <w:sz w:val="22"/>
+          <w:szCs w:val="22"/>
+        </w:rPr>
+        <w:t xml:space="preserve">On a test patch, trigger a turn and confirm the machine lands roughly over the next path</w:t>
+      </w:r>
+    </w:p>
+    <w:p>
+      <w:pPr>
+        <w:pStyle w:val="ListParagraph"/>
+        <w:numPr>
+          <w:ilvl w:val="0"/>
+          <w:numId w:val="3"/>
+        </w:numPr>
+        <w:spacing w:after="40" w:before="40"/>
+      </w:pPr>
+      <w:r>
+        <w:rPr>
+          <w:rFonts w:ascii="Arial" w:cs="Arial" w:eastAsia="Arial" w:hAnsi="Arial"/>
+          <w:color w:val="1A1A1A"/>
+          <w:sz w:val="22"/>
+          <w:szCs w:val="22"/>
+        </w:rPr>
+        <w:t xml:space="preserve">Let the side sensors take over: the machine creeps forward and re-centres; only when BOTH sensors read balanced gaps does it resume normal driving</w:t>
+      </w:r>
+    </w:p>
+    <w:p>
+      <w:pPr>
+        <w:pStyle w:val="ListParagraph"/>
+        <w:numPr>
+          <w:ilvl w:val="0"/>
+          <w:numId w:val="3"/>
+        </w:numPr>
+        <w:spacing w:after="40" w:before="40"/>
+      </w:pPr>
+      <w:r>
+        <w:rPr>
+          <w:rFonts w:ascii="Arial" w:cs="Arial" w:eastAsia="Arial" w:hAnsi="Arial"/>
+          <w:color w:val="1A1A1A"/>
+          <w:sz w:val="22"/>
+          <w:szCs w:val="22"/>
+        </w:rPr>
+        <w:t xml:space="preserve">Adjust the controller's turn radius until the machine lands close enough for the sensors to finish centring quickly</w:t>
+      </w:r>
+    </w:p>
+    <w:p>
+      <w:pPr>
+        <w:spacing w:after="0" w:before="40"/>
+      </w:pPr>
+    </w:p>
+    <w:p>
+      <w:pPr>
+        <w:shd w:fill="E8F5E9" w:val="clear"/>
+        <w:spacing w:after="60" w:before="60"/>
+      </w:pPr>
+      <w:r>
+        <w:rPr>
+          <w:rFonts w:ascii="Arial" w:cs="Arial" w:eastAsia="Arial" w:hAnsi="Arial"/>
+          <w:color w:val="2E7D32"/>
+          <w:sz w:val="22"/>
+          <w:szCs w:val="22"/>
+        </w:rPr>
+        <w:t xml:space="preserve">  The simulation demonstrates this exactly: after the turn arc the state shows RE-ENTERING with a live 'sensor lock 0/8 -&gt; 8/8' counter; once locked it switches to DRIVING.</w:t>
+      </w:r>
+    </w:p>
+    <w:p>
+      <w:pPr>
+        <w:spacing w:after="0" w:before="120"/>
+      </w:pPr>
+    </w:p>
+    <w:p>
+      <w:pPr>
+        <w:pStyle w:val="Heading1"/>
+        <w:shd w:fill="1F4E79" w:val="clear"/>
+        <w:spacing w:after="120" w:before="360"/>
+        <w:ind w:left="120" w:right="120"/>
+      </w:pPr>
+      <w:r>
+        <w:rPr>
+          <w:rFonts w:ascii="Arial" w:cs="Arial" w:eastAsia="Arial" w:hAnsi="Arial"/>
+          <w:b/>
+          <w:bCs/>
+          <w:color w:val="FFFFFF"/>
+          <w:sz w:val="36"/>
+          <w:szCs w:val="36"/>
+        </w:rPr>
+        <w:t xml:space="preserve">Phase 7 — Integration Testing (Bench)</w:t>
       </w:r>
     </w:p>
     <w:p>
@@ -7122,7 +9550,7 @@
           <w:sz w:val="22"/>
           <w:szCs w:val="22"/>
         </w:rPr>
-        <w:t xml:space="preserve">U-TURN triggered by holding marker at &lt; 1.5 m: CAN message observed on bus</w:t>
+        <w:t xml:space="preserve">Both side sensors read sensible distances; centred machine gives balanced readings</w:t>
       </w:r>
     </w:p>
     <w:p>
@@ -7141,7 +9569,7 @@
           <w:sz w:val="22"/>
           <w:szCs w:val="22"/>
         </w:rPr>
-        <w:t xml:space="preserve">E-STOP triggered by disconnecting camera for &gt; 1.5 s: E-STOP CAN message sent</w:t>
+        <w:t xml:space="preserve">Nudging the machine off-centre makes the controller steer back toward centre</w:t>
       </w:r>
     </w:p>
     <w:p>
@@ -7160,7 +9588,7 @@
           <w:sz w:val="22"/>
           <w:szCs w:val="22"/>
         </w:rPr>
-        <w:t xml:space="preserve">Auto-recovery fires when camera reconnects (enable_auto_recovery: true)</w:t>
+        <w:t xml:space="preserve">U-TURN triggered by holding marker at &lt; 1.5 m: CAN message observed on bus</w:t>
       </w:r>
     </w:p>
     <w:p>
@@ -7179,7 +9607,7 @@
           <w:sz w:val="22"/>
           <w:szCs w:val="22"/>
         </w:rPr>
-        <w:t xml:space="preserve">YOLO correctly detects a person walking into frame</w:t>
+        <w:t xml:space="preserve">Steering controller executes the calibrated U-turn arc on U_TURN command</w:t>
       </w:r>
     </w:p>
     <w:p>
@@ -7198,62 +9626,8 @@
           <w:sz w:val="22"/>
           <w:szCs w:val="22"/>
         </w:rPr>
-        <w:t xml:space="preserve">Dashboard accessible from a separate device on the same network</w:t>
-      </w:r>
-    </w:p>
-    <w:p>
-      <w:pPr>
-        <w:spacing w:after="0" w:before="120"/>
-      </w:pPr>
-    </w:p>
-    <w:p>
-      <w:pPr>
-        <w:pStyle w:val="Heading1"/>
-        <w:shd w:fill="1F4E79" w:val="clear"/>
-        <w:spacing w:after="120" w:before="360"/>
-        <w:ind w:left="120" w:right="120"/>
-      </w:pPr>
-      <w:r>
-        <w:rPr>
-          <w:rFonts w:ascii="Arial" w:cs="Arial" w:eastAsia="Arial" w:hAnsi="Arial"/>
-          <w:b/>
-          <w:bCs/>
-          <w:color w:val="FFFFFF"/>
-          <w:sz w:val="36"/>
-          <w:szCs w:val="36"/>
-        </w:rPr>
-        <w:t xml:space="preserve">Phase 6 — Field Testing</w:t>
-      </w:r>
-    </w:p>
-    <w:p>
-      <w:pPr>
-        <w:spacing w:after="0" w:before="60"/>
-      </w:pPr>
-    </w:p>
-    <w:p>
-      <w:pPr>
-        <w:pStyle w:val="Heading2"/>
-        <w:pBdr>
-          <w:bottom w:val="single" w:color="2E75B6" w:sz="8" w:space="1"/>
-        </w:pBdr>
-        <w:spacing w:after="80" w:before="280"/>
-      </w:pPr>
-      <w:r>
-        <w:rPr>
-          <w:rFonts w:ascii="Arial" w:cs="Arial" w:eastAsia="Arial" w:hAnsi="Arial"/>
-          <w:b/>
-          <w:bCs/>
-          <w:color w:val="2E75B6"/>
-          <w:sz w:val="28"/>
-          <w:szCs w:val="28"/>
-        </w:rPr>
-        <w:t xml:space="preserve">Pre-Field Checklist</w:t>
-      </w:r>
-    </w:p>
-    <w:p>
-      <w:pPr>
-        <w:spacing w:after="0" w:before="40"/>
-      </w:pPr>
+        <w:t xml:space="preserve">After the arc, side sensors confirm re-entry (RE-ENTERING -&gt; DRIVING)</w:t>
+      </w:r>
     </w:p>
     <w:p>
       <w:pPr>
@@ -7271,7 +9645,7 @@
           <w:sz w:val="22"/>
           <w:szCs w:val="22"/>
         </w:rPr>
-        <w:t xml:space="preserve">config/default.yaml reviewed and saved — no placeholder values remain</w:t>
+        <w:t xml:space="preserve">E-STOP triggered by disconnecting camera for &gt; 1.5 s: E-STOP CAN message sent</w:t>
       </w:r>
     </w:p>
     <w:p>
@@ -7290,7 +9664,7 @@
           <w:sz w:val="22"/>
           <w:szCs w:val="22"/>
         </w:rPr>
-        <w:t xml:space="preserve">camera_matrix and dist_coeffs updated from real calibration</w:t>
+        <w:t xml:space="preserve">Auto-recovery fires when camera reconnects (enable_auto_recovery: true)</w:t>
       </w:r>
     </w:p>
     <w:p>
@@ -7309,7 +9683,7 @@
           <w:sz w:val="22"/>
           <w:szCs w:val="22"/>
         </w:rPr>
-        <w:t xml:space="preserve">can_interface and can_channel match the hardware adapter</w:t>
+        <w:t xml:space="preserve">YOLO correctly detects a person walking into frame</w:t>
       </w:r>
     </w:p>
     <w:p>
@@ -7328,7 +9702,7 @@
           <w:sz w:val="22"/>
           <w:szCs w:val="22"/>
         </w:rPr>
-        <w:t xml:space="preserve">recording.enabled: true — log all field sessions</w:t>
+        <w:t xml:space="preserve">LAST-ROW marker triggers final turn; STOP marker halts the field</w:t>
       </w:r>
     </w:p>
     <w:p>
@@ -7347,8 +9721,62 @@
           <w:sz w:val="22"/>
           <w:szCs w:val="22"/>
         </w:rPr>
-        <w:t xml:space="preserve">robot_id set to a unique ID (e.g. "robot-field-01")</w:t>
-      </w:r>
+        <w:t xml:space="preserve">Dashboard accessible from a separate device on the same network</w:t>
+      </w:r>
+    </w:p>
+    <w:p>
+      <w:pPr>
+        <w:spacing w:after="0" w:before="120"/>
+      </w:pPr>
+    </w:p>
+    <w:p>
+      <w:pPr>
+        <w:pStyle w:val="Heading1"/>
+        <w:shd w:fill="1F4E79" w:val="clear"/>
+        <w:spacing w:after="120" w:before="360"/>
+        <w:ind w:left="120" w:right="120"/>
+      </w:pPr>
+      <w:r>
+        <w:rPr>
+          <w:rFonts w:ascii="Arial" w:cs="Arial" w:eastAsia="Arial" w:hAnsi="Arial"/>
+          <w:b/>
+          <w:bCs/>
+          <w:color w:val="FFFFFF"/>
+          <w:sz w:val="36"/>
+          <w:szCs w:val="36"/>
+        </w:rPr>
+        <w:t xml:space="preserve">Phase 8 — Field Testing</w:t>
+      </w:r>
+    </w:p>
+    <w:p>
+      <w:pPr>
+        <w:spacing w:after="0" w:before="60"/>
+      </w:pPr>
+    </w:p>
+    <w:p>
+      <w:pPr>
+        <w:pStyle w:val="Heading2"/>
+        <w:pBdr>
+          <w:bottom w:val="single" w:color="2E75B6" w:sz="8" w:space="1"/>
+        </w:pBdr>
+        <w:spacing w:after="80" w:before="280"/>
+      </w:pPr>
+      <w:r>
+        <w:rPr>
+          <w:rFonts w:ascii="Arial" w:cs="Arial" w:eastAsia="Arial" w:hAnsi="Arial"/>
+          <w:b/>
+          <w:bCs/>
+          <w:color w:val="2E75B6"/>
+          <w:sz w:val="28"/>
+          <w:szCs w:val="28"/>
+        </w:rPr>
+        <w:t xml:space="preserve">Pre-Field Checklist</w:t>
+      </w:r>
+    </w:p>
+    <w:p>
+      <w:pPr>
+        <w:spacing w:after="0" w:before="40"/>
+      </w:pPr>
     </w:p>
     <w:p>
       <w:pPr>
@@ -7366,6 +9794,101 @@
           <w:sz w:val="22"/>
           <w:szCs w:val="22"/>
         </w:rPr>
+        <w:t xml:space="preserve">config/default.yaml reviewed and saved — no placeholder values remain</w:t>
+      </w:r>
+    </w:p>
+    <w:p>
+      <w:pPr>
+        <w:pStyle w:val="ListParagraph"/>
+        <w:numPr>
+          <w:ilvl w:val="0"/>
+          <w:numId w:val="4"/>
+        </w:numPr>
+        <w:spacing w:after="30" w:before="30"/>
+      </w:pPr>
+      <w:r>
+        <w:rPr>
+          <w:rFonts w:ascii="Arial" w:cs="Arial" w:eastAsia="Arial" w:hAnsi="Arial"/>
+          <w:color w:val="1A1A1A"/>
+          <w:sz w:val="22"/>
+          <w:szCs w:val="22"/>
+        </w:rPr>
+        <w:t xml:space="preserve">camera_matrix and dist_coeffs updated from real calibration</w:t>
+      </w:r>
+    </w:p>
+    <w:p>
+      <w:pPr>
+        <w:pStyle w:val="ListParagraph"/>
+        <w:numPr>
+          <w:ilvl w:val="0"/>
+          <w:numId w:val="4"/>
+        </w:numPr>
+        <w:spacing w:after="30" w:before="30"/>
+      </w:pPr>
+      <w:r>
+        <w:rPr>
+          <w:rFonts w:ascii="Arial" w:cs="Arial" w:eastAsia="Arial" w:hAnsi="Arial"/>
+          <w:color w:val="1A1A1A"/>
+          <w:sz w:val="22"/>
+          <w:szCs w:val="22"/>
+        </w:rPr>
+        <w:t xml:space="preserve">can_interface and can_channel match the hardware adapter</w:t>
+      </w:r>
+    </w:p>
+    <w:p>
+      <w:pPr>
+        <w:pStyle w:val="ListParagraph"/>
+        <w:numPr>
+          <w:ilvl w:val="0"/>
+          <w:numId w:val="4"/>
+        </w:numPr>
+        <w:spacing w:after="30" w:before="30"/>
+      </w:pPr>
+      <w:r>
+        <w:rPr>
+          <w:rFonts w:ascii="Arial" w:cs="Arial" w:eastAsia="Arial" w:hAnsi="Arial"/>
+          <w:color w:val="1A1A1A"/>
+          <w:sz w:val="22"/>
+          <w:szCs w:val="22"/>
+        </w:rPr>
+        <w:t xml:space="preserve">recording.enabled: true — log all field sessions</w:t>
+      </w:r>
+    </w:p>
+    <w:p>
+      <w:pPr>
+        <w:pStyle w:val="ListParagraph"/>
+        <w:numPr>
+          <w:ilvl w:val="0"/>
+          <w:numId w:val="4"/>
+        </w:numPr>
+        <w:spacing w:after="30" w:before="30"/>
+      </w:pPr>
+      <w:r>
+        <w:rPr>
+          <w:rFonts w:ascii="Arial" w:cs="Arial" w:eastAsia="Arial" w:hAnsi="Arial"/>
+          <w:color w:val="1A1A1A"/>
+          <w:sz w:val="22"/>
+          <w:szCs w:val="22"/>
+        </w:rPr>
+        <w:t xml:space="preserve">robot_id set to a unique ID (e.g. "robot-field-01")</w:t>
+      </w:r>
+    </w:p>
+    <w:p>
+      <w:pPr>
+        <w:pStyle w:val="ListParagraph"/>
+        <w:numPr>
+          <w:ilvl w:val="0"/>
+          <w:numId w:val="4"/>
+        </w:numPr>
+        <w:spacing w:after="30" w:before="30"/>
+      </w:pPr>
+      <w:r>
+        <w:rPr>
+          <w:rFonts w:ascii="Arial" w:cs="Arial" w:eastAsia="Arial" w:hAnsi="Arial"/>
+          <w:color w:val="1A1A1A"/>
+          <w:sz w:val="22"/>
+          <w:szCs w:val="22"/>
+        </w:rPr>
         <w:t xml:space="preserve">Battery / power supply charged</w:t>
       </w:r>
     </w:p>
@@ -7510,7 +10033,7 @@
           <w:sz w:val="22"/>
           <w:szCs w:val="22"/>
         </w:rPr>
-        <w:t xml:space="preserve">Confirm robot straightens and resumes DRIVING</w:t>
+        <w:t xml:space="preserve">Confirm RE-ENTERING then DRIVING (side sensors centred the machine after the turn)</w:t>
       </w:r>
     </w:p>
     <w:p>
@@ -7529,7 +10052,7 @@
           <w:sz w:val="22"/>
           <w:szCs w:val="22"/>
         </w:rPr>
-        <w:t xml:space="preserve">Walk in front of the robot — confirm STATE transitions to STOPPED immediately</w:t>
+        <w:t xml:space="preserve">Confirm the side sensors hold the machine centred along each row</w:t>
       </w:r>
     </w:p>
     <w:p>
@@ -7548,7 +10071,45 @@
           <w:sz w:val="22"/>
           <w:szCs w:val="22"/>
         </w:rPr>
+        <w:t xml:space="preserve">Walk in front of the robot — confirm STATE transitions to STOPPED immediately</w:t>
+      </w:r>
+    </w:p>
+    <w:p>
+      <w:pPr>
+        <w:pStyle w:val="ListParagraph"/>
+        <w:numPr>
+          <w:ilvl w:val="0"/>
+          <w:numId w:val="3"/>
+        </w:numPr>
+        <w:spacing w:after="40" w:before="40"/>
+      </w:pPr>
+      <w:r>
+        <w:rPr>
+          <w:rFonts w:ascii="Arial" w:cs="Arial" w:eastAsia="Arial" w:hAnsi="Arial"/>
+          <w:color w:val="1A1A1A"/>
+          <w:sz w:val="22"/>
+          <w:szCs w:val="22"/>
+        </w:rPr>
         <w:t xml:space="preserve">Walk away — confirm STATE resumes (if auto_recovery: true)</w:t>
+      </w:r>
+    </w:p>
+    <w:p>
+      <w:pPr>
+        <w:pStyle w:val="ListParagraph"/>
+        <w:numPr>
+          <w:ilvl w:val="0"/>
+          <w:numId w:val="3"/>
+        </w:numPr>
+        <w:spacing w:after="40" w:before="40"/>
+      </w:pPr>
+      <w:r>
+        <w:rPr>
+          <w:rFonts w:ascii="Arial" w:cs="Arial" w:eastAsia="Arial" w:hAnsi="Arial"/>
+          <w:color w:val="1A1A1A"/>
+          <w:sz w:val="22"/>
+          <w:szCs w:val="22"/>
+        </w:rPr>
+        <w:t xml:space="preserve">At the last row, confirm LAST-ROW then STOP ends the field automatically</w:t>
       </w:r>
     </w:p>
     <w:p>
@@ -8449,6 +11010,362 @@
           </w:p>
         </w:tc>
       </w:tr>
+      <w:tr>
+        <w:tc>
+          <w:tcPr>
+            <w:tcW w:type="dxa" w:w="2800"/>
+            <w:tcBorders>
+              <w:top w:val="single" w:color="CCCCCC" w:sz="4"/>
+              <w:left w:val="single" w:color="CCCCCC" w:sz="4"/>
+              <w:bottom w:val="single" w:color="CCCCCC" w:sz="4"/>
+              <w:right w:val="single" w:color="CCCCCC" w:sz="4"/>
+            </w:tcBorders>
+            <w:shd w:fill="FFFFFF" w:val="clear"/>
+            <w:tcMar>
+              <w:top w:type="dxa" w:w="80"/>
+              <w:left w:type="dxa" w:w="120"/>
+              <w:bottom w:type="dxa" w:w="80"/>
+              <w:right w:type="dxa" w:w="120"/>
+            </w:tcMar>
+          </w:tcPr>
+          <w:p>
+            <w:r>
+              <w:rPr>
+                <w:rFonts w:ascii="Arial" w:cs="Arial" w:eastAsia="Arial" w:hAnsi="Arial"/>
+                <w:color w:val="1A1A1A"/>
+                <w:sz w:val="20"/>
+                <w:szCs w:val="20"/>
+              </w:rPr>
+              <w:t xml:space="preserve">Wanders off-centre in a row</w:t>
+            </w:r>
+          </w:p>
+        </w:tc>
+        <w:tc>
+          <w:tcPr>
+            <w:tcW w:type="dxa" w:w="4000"/>
+            <w:tcBorders>
+              <w:top w:val="single" w:color="CCCCCC" w:sz="4"/>
+              <w:left w:val="single" w:color="CCCCCC" w:sz="4"/>
+              <w:bottom w:val="single" w:color="CCCCCC" w:sz="4"/>
+              <w:right w:val="single" w:color="CCCCCC" w:sz="4"/>
+            </w:tcBorders>
+            <w:shd w:fill="FFFFFF" w:val="clear"/>
+            <w:tcMar>
+              <w:top w:type="dxa" w:w="80"/>
+              <w:left w:type="dxa" w:w="120"/>
+              <w:bottom w:type="dxa" w:w="80"/>
+              <w:right w:type="dxa" w:w="120"/>
+            </w:tcMar>
+          </w:tcPr>
+          <w:p>
+            <w:r>
+              <w:rPr>
+                <w:rFonts w:ascii="Arial" w:cs="Arial" w:eastAsia="Arial" w:hAnsi="Arial"/>
+                <w:color w:val="1A1A1A"/>
+                <w:sz w:val="20"/>
+                <w:szCs w:val="20"/>
+              </w:rPr>
+              <w:t xml:space="preserve">side-sensor nudge gain</w:t>
+            </w:r>
+          </w:p>
+        </w:tc>
+        <w:tc>
+          <w:tcPr>
+            <w:tcW w:type="dxa" w:w="3280"/>
+            <w:tcBorders>
+              <w:top w:val="single" w:color="CCCCCC" w:sz="4"/>
+              <w:left w:val="single" w:color="CCCCCC" w:sz="4"/>
+              <w:bottom w:val="single" w:color="CCCCCC" w:sz="4"/>
+              <w:right w:val="single" w:color="CCCCCC" w:sz="4"/>
+            </w:tcBorders>
+            <w:shd w:fill="FFFFFF" w:val="clear"/>
+            <w:tcMar>
+              <w:top w:type="dxa" w:w="80"/>
+              <w:left w:type="dxa" w:w="120"/>
+              <w:bottom w:type="dxa" w:w="80"/>
+              <w:right w:type="dxa" w:w="120"/>
+            </w:tcMar>
+          </w:tcPr>
+          <w:p>
+            <w:r>
+              <w:rPr>
+                <w:rFonts w:ascii="Arial" w:cs="Arial" w:eastAsia="Arial" w:hAnsi="Arial"/>
+                <w:color w:val="1A1A1A"/>
+                <w:sz w:val="20"/>
+                <w:szCs w:val="20"/>
+              </w:rPr>
+              <w:t xml:space="preserve">Increase</w:t>
+            </w:r>
+          </w:p>
+        </w:tc>
+      </w:tr>
+      <w:tr>
+        <w:tc>
+          <w:tcPr>
+            <w:tcW w:type="dxa" w:w="2800"/>
+            <w:tcBorders>
+              <w:top w:val="single" w:color="CCCCCC" w:sz="4"/>
+              <w:left w:val="single" w:color="CCCCCC" w:sz="4"/>
+              <w:bottom w:val="single" w:color="CCCCCC" w:sz="4"/>
+              <w:right w:val="single" w:color="CCCCCC" w:sz="4"/>
+            </w:tcBorders>
+            <w:shd w:fill="F2F2F2" w:val="clear"/>
+            <w:tcMar>
+              <w:top w:type="dxa" w:w="80"/>
+              <w:left w:type="dxa" w:w="120"/>
+              <w:bottom w:type="dxa" w:w="80"/>
+              <w:right w:type="dxa" w:w="120"/>
+            </w:tcMar>
+          </w:tcPr>
+          <w:p>
+            <w:r>
+              <w:rPr>
+                <w:rFonts w:ascii="Arial" w:cs="Arial" w:eastAsia="Arial" w:hAnsi="Arial"/>
+                <w:color w:val="1A1A1A"/>
+                <w:sz w:val="20"/>
+                <w:szCs w:val="20"/>
+              </w:rPr>
+              <w:t xml:space="preserve">Weaves / over-corrects side to side</w:t>
+            </w:r>
+          </w:p>
+        </w:tc>
+        <w:tc>
+          <w:tcPr>
+            <w:tcW w:type="dxa" w:w="4000"/>
+            <w:tcBorders>
+              <w:top w:val="single" w:color="CCCCCC" w:sz="4"/>
+              <w:left w:val="single" w:color="CCCCCC" w:sz="4"/>
+              <w:bottom w:val="single" w:color="CCCCCC" w:sz="4"/>
+              <w:right w:val="single" w:color="CCCCCC" w:sz="4"/>
+            </w:tcBorders>
+            <w:shd w:fill="F2F2F2" w:val="clear"/>
+            <w:tcMar>
+              <w:top w:type="dxa" w:w="80"/>
+              <w:left w:type="dxa" w:w="120"/>
+              <w:bottom w:type="dxa" w:w="80"/>
+              <w:right w:type="dxa" w:w="120"/>
+            </w:tcMar>
+          </w:tcPr>
+          <w:p>
+            <w:r>
+              <w:rPr>
+                <w:rFonts w:ascii="Arial" w:cs="Arial" w:eastAsia="Arial" w:hAnsi="Arial"/>
+                <w:color w:val="1A1A1A"/>
+                <w:sz w:val="20"/>
+                <w:szCs w:val="20"/>
+              </w:rPr>
+              <w:t xml:space="preserve">side-sensor nudge gain</w:t>
+            </w:r>
+          </w:p>
+        </w:tc>
+        <w:tc>
+          <w:tcPr>
+            <w:tcW w:type="dxa" w:w="3280"/>
+            <w:tcBorders>
+              <w:top w:val="single" w:color="CCCCCC" w:sz="4"/>
+              <w:left w:val="single" w:color="CCCCCC" w:sz="4"/>
+              <w:bottom w:val="single" w:color="CCCCCC" w:sz="4"/>
+              <w:right w:val="single" w:color="CCCCCC" w:sz="4"/>
+            </w:tcBorders>
+            <w:shd w:fill="F2F2F2" w:val="clear"/>
+            <w:tcMar>
+              <w:top w:type="dxa" w:w="80"/>
+              <w:left w:type="dxa" w:w="120"/>
+              <w:bottom w:type="dxa" w:w="80"/>
+              <w:right w:type="dxa" w:w="120"/>
+            </w:tcMar>
+          </w:tcPr>
+          <w:p>
+            <w:r>
+              <w:rPr>
+                <w:rFonts w:ascii="Arial" w:cs="Arial" w:eastAsia="Arial" w:hAnsi="Arial"/>
+                <w:color w:val="1A1A1A"/>
+                <w:sz w:val="20"/>
+                <w:szCs w:val="20"/>
+              </w:rPr>
+              <w:t xml:space="preserve">Decrease</w:t>
+            </w:r>
+          </w:p>
+        </w:tc>
+      </w:tr>
+      <w:tr>
+        <w:tc>
+          <w:tcPr>
+            <w:tcW w:type="dxa" w:w="2800"/>
+            <w:tcBorders>
+              <w:top w:val="single" w:color="CCCCCC" w:sz="4"/>
+              <w:left w:val="single" w:color="CCCCCC" w:sz="4"/>
+              <w:bottom w:val="single" w:color="CCCCCC" w:sz="4"/>
+              <w:right w:val="single" w:color="CCCCCC" w:sz="4"/>
+            </w:tcBorders>
+            <w:shd w:fill="FFFFFF" w:val="clear"/>
+            <w:tcMar>
+              <w:top w:type="dxa" w:w="80"/>
+              <w:left w:type="dxa" w:w="120"/>
+              <w:bottom w:type="dxa" w:w="80"/>
+              <w:right w:type="dxa" w:w="120"/>
+            </w:tcMar>
+          </w:tcPr>
+          <w:p>
+            <w:r>
+              <w:rPr>
+                <w:rFonts w:ascii="Arial" w:cs="Arial" w:eastAsia="Arial" w:hAnsi="Arial"/>
+                <w:color w:val="1A1A1A"/>
+                <w:sz w:val="20"/>
+                <w:szCs w:val="20"/>
+              </w:rPr>
+              <w:t xml:space="preserve">Slow to settle after a turn</w:t>
+            </w:r>
+          </w:p>
+        </w:tc>
+        <w:tc>
+          <w:tcPr>
+            <w:tcW w:type="dxa" w:w="4000"/>
+            <w:tcBorders>
+              <w:top w:val="single" w:color="CCCCCC" w:sz="4"/>
+              <w:left w:val="single" w:color="CCCCCC" w:sz="4"/>
+              <w:bottom w:val="single" w:color="CCCCCC" w:sz="4"/>
+              <w:right w:val="single" w:color="CCCCCC" w:sz="4"/>
+            </w:tcBorders>
+            <w:shd w:fill="FFFFFF" w:val="clear"/>
+            <w:tcMar>
+              <w:top w:type="dxa" w:w="80"/>
+              <w:left w:type="dxa" w:w="120"/>
+              <w:bottom w:type="dxa" w:w="80"/>
+              <w:right w:type="dxa" w:w="120"/>
+            </w:tcMar>
+          </w:tcPr>
+          <w:p>
+            <w:r>
+              <w:rPr>
+                <w:rFonts w:ascii="Arial" w:cs="Arial" w:eastAsia="Arial" w:hAnsi="Arial"/>
+                <w:color w:val="1A1A1A"/>
+                <w:sz w:val="20"/>
+                <w:szCs w:val="20"/>
+              </w:rPr>
+              <w:t xml:space="preserve">re-entry balance tolerance / lock frames</w:t>
+            </w:r>
+          </w:p>
+        </w:tc>
+        <w:tc>
+          <w:tcPr>
+            <w:tcW w:type="dxa" w:w="3280"/>
+            <w:tcBorders>
+              <w:top w:val="single" w:color="CCCCCC" w:sz="4"/>
+              <w:left w:val="single" w:color="CCCCCC" w:sz="4"/>
+              <w:bottom w:val="single" w:color="CCCCCC" w:sz="4"/>
+              <w:right w:val="single" w:color="CCCCCC" w:sz="4"/>
+            </w:tcBorders>
+            <w:shd w:fill="FFFFFF" w:val="clear"/>
+            <w:tcMar>
+              <w:top w:type="dxa" w:w="80"/>
+              <w:left w:type="dxa" w:w="120"/>
+              <w:bottom w:type="dxa" w:w="80"/>
+              <w:right w:type="dxa" w:w="120"/>
+            </w:tcMar>
+          </w:tcPr>
+          <w:p>
+            <w:r>
+              <w:rPr>
+                <w:rFonts w:ascii="Arial" w:cs="Arial" w:eastAsia="Arial" w:hAnsi="Arial"/>
+                <w:color w:val="1A1A1A"/>
+                <w:sz w:val="20"/>
+                <w:szCs w:val="20"/>
+              </w:rPr>
+              <w:t xml:space="preserve">Loosen tolerance / fewer lock frames</w:t>
+            </w:r>
+          </w:p>
+        </w:tc>
+      </w:tr>
+      <w:tr>
+        <w:tc>
+          <w:tcPr>
+            <w:tcW w:type="dxa" w:w="2800"/>
+            <w:tcBorders>
+              <w:top w:val="single" w:color="CCCCCC" w:sz="4"/>
+              <w:left w:val="single" w:color="CCCCCC" w:sz="4"/>
+              <w:bottom w:val="single" w:color="CCCCCC" w:sz="4"/>
+              <w:right w:val="single" w:color="CCCCCC" w:sz="4"/>
+            </w:tcBorders>
+            <w:shd w:fill="F2F2F2" w:val="clear"/>
+            <w:tcMar>
+              <w:top w:type="dxa" w:w="80"/>
+              <w:left w:type="dxa" w:w="120"/>
+              <w:bottom w:type="dxa" w:w="80"/>
+              <w:right w:type="dxa" w:w="120"/>
+            </w:tcMar>
+          </w:tcPr>
+          <w:p>
+            <w:r>
+              <w:rPr>
+                <w:rFonts w:ascii="Arial" w:cs="Arial" w:eastAsia="Arial" w:hAnsi="Arial"/>
+                <w:color w:val="1A1A1A"/>
+                <w:sz w:val="20"/>
+                <w:szCs w:val="20"/>
+              </w:rPr>
+              <w:t xml:space="preserve">Resumes before truly centred</w:t>
+            </w:r>
+          </w:p>
+        </w:tc>
+        <w:tc>
+          <w:tcPr>
+            <w:tcW w:type="dxa" w:w="4000"/>
+            <w:tcBorders>
+              <w:top w:val="single" w:color="CCCCCC" w:sz="4"/>
+              <w:left w:val="single" w:color="CCCCCC" w:sz="4"/>
+              <w:bottom w:val="single" w:color="CCCCCC" w:sz="4"/>
+              <w:right w:val="single" w:color="CCCCCC" w:sz="4"/>
+            </w:tcBorders>
+            <w:shd w:fill="F2F2F2" w:val="clear"/>
+            <w:tcMar>
+              <w:top w:type="dxa" w:w="80"/>
+              <w:left w:type="dxa" w:w="120"/>
+              <w:bottom w:type="dxa" w:w="80"/>
+              <w:right w:type="dxa" w:w="120"/>
+            </w:tcMar>
+          </w:tcPr>
+          <w:p>
+            <w:r>
+              <w:rPr>
+                <w:rFonts w:ascii="Arial" w:cs="Arial" w:eastAsia="Arial" w:hAnsi="Arial"/>
+                <w:color w:val="1A1A1A"/>
+                <w:sz w:val="20"/>
+                <w:szCs w:val="20"/>
+              </w:rPr>
+              <w:t xml:space="preserve">re-entry balance tolerance / lock frames</w:t>
+            </w:r>
+          </w:p>
+        </w:tc>
+        <w:tc>
+          <w:tcPr>
+            <w:tcW w:type="dxa" w:w="3280"/>
+            <w:tcBorders>
+              <w:top w:val="single" w:color="CCCCCC" w:sz="4"/>
+              <w:left w:val="single" w:color="CCCCCC" w:sz="4"/>
+              <w:bottom w:val="single" w:color="CCCCCC" w:sz="4"/>
+              <w:right w:val="single" w:color="CCCCCC" w:sz="4"/>
+            </w:tcBorders>
+            <w:shd w:fill="F2F2F2" w:val="clear"/>
+            <w:tcMar>
+              <w:top w:type="dxa" w:w="80"/>
+              <w:left w:type="dxa" w:w="120"/>
+              <w:bottom w:type="dxa" w:w="80"/>
+              <w:right w:type="dxa" w:w="120"/>
+            </w:tcMar>
+          </w:tcPr>
+          <w:p>
+            <w:r>
+              <w:rPr>
+                <w:rFonts w:ascii="Arial" w:cs="Arial" w:eastAsia="Arial" w:hAnsi="Arial"/>
+                <w:color w:val="1A1A1A"/>
+                <w:sz w:val="20"/>
+                <w:szCs w:val="20"/>
+              </w:rPr>
+              <w:t xml:space="preserve">Tighten tolerance / more lock frames</w:t>
+            </w:r>
+          </w:p>
+        </w:tc>
+      </w:tr>
     </w:tbl>
     <w:p>
       <w:pPr>
@@ -8491,7 +11408,7 @@
           <w:sz w:val="36"/>
           <w:szCs w:val="36"/>
         </w:rPr>
-        <w:t xml:space="preserve">Phase 7 — Ongoing Monitoring</w:t>
+        <w:t xml:space="preserve">Phase 9 — Ongoing Monitoring</w:t>
       </w:r>
     </w:p>
     <w:p>

</xml_diff>